<commit_message>
docs(knowledge): use a generic integration page in the layout example
The living documentation example named integration/mission-control.md, a
page tied to one specific system. A generic external systems page shows the
same layout without implying a product the framework does not describe. The
compiled draft is regenerated to carry the same wording.
</commit_message>
<xml_diff>
--- a/compiled/AI-Assisted Software Engineering Framework - draft EN202608161000.docx
+++ b/compiled/AI-Assisted Software Engineering Framework - draft EN202608161000.docx
@@ -1,6 +1,6 @@
 
 <file path=word/document.xml><?xml version="1.0" encoding="utf-8"?>
-<w:document xmlns:wpc="http://schemas.microsoft.com/office/word/2010/wordprocessingCanvas" xmlns:cx="http://schemas.microsoft.com/office/drawing/2014/chartex" xmlns:cx1="http://schemas.microsoft.com/office/drawing/2015/9/8/chartex" xmlns:cx2="http://schemas.microsoft.com/office/drawing/2015/10/21/chartex" xmlns:cx3="http://schemas.microsoft.com/office/drawing/2016/5/9/chartex" xmlns:cx4="http://schemas.microsoft.com/office/drawing/2016/5/10/chartex" xmlns:cx5="http://schemas.microsoft.com/office/drawing/2016/5/11/chartex" xmlns:cx6="http://schemas.microsoft.com/office/drawing/2016/5/12/chartex" xmlns:cx7="http://schemas.microsoft.com/office/drawing/2016/5/13/chartex" xmlns:cx8="http://schemas.microsoft.com/office/drawing/2016/5/14/chartex" xmlns:mc="http://schemas.openxmlformats.org/markup-compatibility/2006" xmlns:aink="http://schemas.microsoft.com/office/drawing/2016/ink" xmlns:am3d="http://schemas.microsoft.com/office/drawing/2017/model3d" xmlns:o="urn:schemas-microsoft-com:office:office" xmlns:oel="http://schemas.microsoft.com/office/2019/extlst" xmlns:r="http://schemas.openxmlformats.org/officeDocument/2006/relationships" xmlns:m="http://schemas.openxmlformats.org/officeDocument/2006/math" xmlns:v="urn:schemas-microsoft-com:vml" xmlns:wp14="http://schemas.microsoft.com/office/word/2010/wordprocessingDrawing" xmlns:wp="http://schemas.openxmlformats.org/drawingml/2006/wordprocessingDrawing" xmlns:w10="urn:schemas-microsoft-com:office:word" xmlns:w="http://schemas.openxmlformats.org/wordprocessingml/2006/main" xmlns:w14="http://schemas.microsoft.com/office/word/2010/wordml" xmlns:w15="http://schemas.microsoft.com/office/word/2012/wordml" xmlns:w16cei="http://schemas.microsoft.com/office/word/2026/wordml/cei" xmlns:w16cex="http://schemas.microsoft.com/office/word/2018/wordml/cex" xmlns:w16cid="http://schemas.microsoft.com/office/word/2016/wordml/cid" xmlns:w16="http://schemas.microsoft.com/office/word/2018/wordml" xmlns:w16du="http://schemas.microsoft.com/office/word/2023/wordml/word16du" xmlns:w16sdtdh="http://schemas.microsoft.com/office/word/2020/wordml/sdtdatahash" xmlns:w16sdtfl="http://schemas.microsoft.com/office/word/2024/wordml/sdtformatlock" xmlns:w16se="http://schemas.microsoft.com/office/word/2015/wordml/symex" xmlns:wpg="http://schemas.microsoft.com/office/word/2010/wordprocessingGroup" xmlns:wpi="http://schemas.microsoft.com/office/word/2010/wordprocessingInk" xmlns:wne="http://schemas.microsoft.com/office/word/2006/wordml" xmlns:wps="http://schemas.microsoft.com/office/word/2010/wordprocessingShape" mc:Ignorable="w14 w15 w16se w16cid w16 w16cex w16sdtdh w16sdtfl w16du wp14">
+<w:document xmlns:wpc="http://schemas.microsoft.com/office/word/2010/wordprocessingCanvas" xmlns:cx="http://schemas.microsoft.com/office/drawing/2014/chartex" xmlns:cx1="http://schemas.microsoft.com/office/drawing/2015/9/8/chartex" xmlns:cx2="http://schemas.microsoft.com/office/drawing/2015/10/21/chartex" xmlns:cx3="http://schemas.microsoft.com/office/drawing/2016/5/9/chartex" xmlns:cx4="http://schemas.microsoft.com/office/drawing/2016/5/10/chartex" xmlns:cx5="http://schemas.microsoft.com/office/drawing/2016/5/11/chartex" xmlns:cx6="http://schemas.microsoft.com/office/drawing/2016/5/12/chartex" xmlns:cx7="http://schemas.microsoft.com/office/drawing/2016/5/13/chartex" xmlns:cx8="http://schemas.microsoft.com/office/drawing/2016/5/14/chartex" xmlns:mc="http://schemas.openxmlformats.org/markup-compatibility/2006" xmlns:aink="http://schemas.microsoft.com/office/drawing/2016/ink" xmlns:am3d="http://schemas.microsoft.com/office/drawing/2017/model3d" xmlns:o="urn:schemas-microsoft-com:office:office" xmlns:oel="http://schemas.microsoft.com/office/2019/extlst" xmlns:r="http://schemas.openxmlformats.org/officeDocument/2006/relationships" xmlns:m="http://schemas.openxmlformats.org/officeDocument/2006/math" xmlns:v="urn:schemas-microsoft-com:vml" xmlns:wp14="http://schemas.microsoft.com/office/word/2010/wordprocessingDrawing" xmlns:wp="http://schemas.openxmlformats.org/drawingml/2006/wordprocessingDrawing" xmlns:w10="urn:schemas-microsoft-com:office:word" xmlns:w="http://schemas.openxmlformats.org/wordprocessingml/2006/main" xmlns:w14="http://schemas.microsoft.com/office/word/2010/wordml" xmlns:w15="http://schemas.microsoft.com/office/word/2012/wordml" xmlns:w16cex="http://schemas.microsoft.com/office/word/2018/wordml/cex" xmlns:w16cid="http://schemas.microsoft.com/office/word/2016/wordml/cid" xmlns:w16="http://schemas.microsoft.com/office/word/2018/wordml" xmlns:w16du="http://schemas.microsoft.com/office/word/2023/wordml/word16du" xmlns:w16sdtdh="http://schemas.microsoft.com/office/word/2020/wordml/sdtdatahash" xmlns:w16sdtfl="http://schemas.microsoft.com/office/word/2024/wordml/sdtformatlock" xmlns:w16se="http://schemas.microsoft.com/office/word/2015/wordml/symex" xmlns:wpg="http://schemas.microsoft.com/office/word/2010/wordprocessingGroup" xmlns:wpi="http://schemas.microsoft.com/office/word/2010/wordprocessingInk" xmlns:wne="http://schemas.microsoft.com/office/word/2006/wordml" xmlns:wps="http://schemas.microsoft.com/office/word/2010/wordprocessingShape" mc:Ignorable="w14 w15 w16se w16cid w16 w16cex w16sdtdh w16sdtfl w16du wp14">
   <w:body>
     <w:p>
       <w:pPr>
@@ -555,14 +555,7 @@
           <w:rFonts w:ascii="Arial" w:hAnsi="Arial" w:cs="Arial"/>
           <w:b/>
         </w:rPr>
-        <w:t>Two parts</w:t>
-      </w:r>
-      <w:r>
-        <w:rPr>
-          <w:rFonts w:ascii="Arial" w:hAnsi="Arial" w:cs="Arial"/>
-          <w:b/>
-        </w:rPr>
-        <w:t xml:space="preserve"> deliberately separated.</w:t>
+        <w:t>Two parts deliberately separated.</w:t>
       </w:r>
     </w:p>
     <w:p>
@@ -2683,7 +2676,6 @@
         <w:rPr>
           <w:rFonts w:ascii="Arial" w:hAnsi="Arial" w:cs="Arial"/>
         </w:rPr>
-        <w:lastRenderedPageBreak/>
         <w:t>Part I — Proposed Engineering Standard</w:t>
       </w:r>
     </w:p>
@@ -3055,7 +3047,6 @@
         <w:rPr>
           <w:rFonts w:ascii="Arial" w:hAnsi="Arial" w:cs="Arial"/>
         </w:rPr>
-        <w:lastRenderedPageBreak/>
         <w:t>2. Scope</w:t>
       </w:r>
     </w:p>
@@ -3609,7 +3600,6 @@
         <w:rPr>
           <w:rFonts w:ascii="Arial" w:hAnsi="Arial" w:cs="Arial"/>
         </w:rPr>
-        <w:lastRenderedPageBreak/>
         <w:t>Multi-agent development systems.</w:t>
       </w:r>
     </w:p>
@@ -4007,6 +3997,7 @@
       <w:r>
         <w:rPr>
           <w:rFonts w:ascii="Arial" w:hAnsi="Arial" w:cs="Arial"/>
+          <w:noProof/>
         </w:rPr>
         <w:drawing>
           <wp:inline distT="0" distB="0" distL="0" distR="0" wp14:anchorId="62F5DAE4" wp14:editId="52F6CC24">
@@ -4104,7 +4095,6 @@
               <w:rPr>
                 <w:rFonts w:ascii="Arial" w:hAnsi="Arial" w:cs="Arial"/>
               </w:rPr>
-              <w:lastRenderedPageBreak/>
               <w:t>Link</w:t>
             </w:r>
           </w:p>
@@ -4703,7 +4693,6 @@
         <w:rPr>
           <w:rFonts w:ascii="Arial" w:hAnsi="Arial" w:cs="Arial"/>
         </w:rPr>
-        <w:lastRenderedPageBreak/>
         <w:t>Why the order matters</w:t>
       </w:r>
     </w:p>
@@ -4973,7 +4962,6 @@
         <w:rPr>
           <w:rFonts w:ascii="Arial" w:hAnsi="Arial" w:cs="Arial"/>
         </w:rPr>
-        <w:lastRenderedPageBreak/>
         <w:t>Addressability, briefly</w:t>
       </w:r>
     </w:p>
@@ -5030,6 +5018,7 @@
       <w:r>
         <w:rPr>
           <w:rFonts w:ascii="Arial" w:hAnsi="Arial" w:cs="Arial"/>
+          <w:noProof/>
         </w:rPr>
         <w:drawing>
           <wp:inline distT="0" distB="0" distL="0" distR="0" wp14:anchorId="07AACE9C" wp14:editId="6B8B0306">
@@ -5208,7 +5197,6 @@
         <w:rPr>
           <w:rFonts w:ascii="Arial" w:hAnsi="Arial" w:cs="Arial"/>
         </w:rPr>
-        <w:lastRenderedPageBreak/>
         <w:t>5. AI Capability Model: Realistic Expectations and Known Failure Modes</w:t>
       </w:r>
     </w:p>
@@ -5587,7 +5575,6 @@
         <w:rPr>
           <w:rFonts w:ascii="Arial" w:hAnsi="Arial" w:cs="Arial"/>
         </w:rPr>
-        <w:lastRenderedPageBreak/>
         <w:t>Pattern reproduction is not engineering synthesis</w:t>
       </w:r>
     </w:p>
@@ -5887,7 +5874,6 @@
           <w:rFonts w:ascii="Arial" w:hAnsi="Arial" w:cs="Arial"/>
           <w:b/>
         </w:rPr>
-        <w:lastRenderedPageBreak/>
         <w:t>Two-way confirmation.</w:t>
       </w:r>
       <w:r>
@@ -5992,6 +5978,7 @@
       <w:r>
         <w:rPr>
           <w:rFonts w:ascii="Arial" w:hAnsi="Arial" w:cs="Arial"/>
+          <w:noProof/>
         </w:rPr>
         <w:drawing>
           <wp:inline distT="0" distB="0" distL="0" distR="0" wp14:anchorId="7B6270FD" wp14:editId="3FBB1B15">
@@ -6059,7 +6046,6 @@
         <w:rPr>
           <w:rFonts w:ascii="Arial" w:hAnsi="Arial" w:cs="Arial"/>
         </w:rPr>
-        <w:lastRenderedPageBreak/>
         <w:t>Working practices</w:t>
       </w:r>
     </w:p>
@@ -6312,7 +6298,6 @@
         <w:rPr>
           <w:rFonts w:ascii="Arial" w:hAnsi="Arial" w:cs="Arial"/>
         </w:rPr>
-        <w:lastRenderedPageBreak/>
         <w:t>Confronting models against each other</w:t>
       </w:r>
     </w:p>
@@ -6520,7 +6505,6 @@
         <w:rPr>
           <w:rFonts w:ascii="Arial" w:hAnsi="Arial" w:cs="Arial"/>
         </w:rPr>
-        <w:lastRenderedPageBreak/>
         <w:t>expectation set out in the verification-independence section.</w:t>
       </w:r>
     </w:p>
@@ -6683,7 +6667,6 @@
         <w:rPr>
           <w:rFonts w:ascii="Arial" w:hAnsi="Arial" w:cs="Arial"/>
         </w:rPr>
-        <w:lastRenderedPageBreak/>
         <w:t>7. Context Economy: Coherence, Degradation and Model Fit</w:t>
       </w:r>
     </w:p>
@@ -6916,7 +6899,6 @@
         <w:rPr>
           <w:rFonts w:ascii="Arial" w:hAnsi="Arial" w:cs="Arial"/>
         </w:rPr>
-        <w:lastRenderedPageBreak/>
         <w:t>When a session must continue past the point where its history is mostly noise, it SHOULD be compacted deliberately: a summary of what was decided, what is done, what is in progress and what is blocked, carried into a fresh context, with the working state captured in the repository rather than in the conversation.</w:t>
       </w:r>
     </w:p>
@@ -7179,7 +7161,6 @@
         <w:rPr>
           <w:rFonts w:ascii="Arial" w:hAnsi="Arial" w:cs="Arial"/>
         </w:rPr>
-        <w:lastRenderedPageBreak/>
         <w:t>Documents SHOULD make their kind evident — description, intent, or requirement. The damaging case is not the stale document but the one whose kind is ambiguous: a plan is a legitimate document, a plan mistaken for a description is a trap, and a description mistaken for a requirement is worse.</w:t>
       </w:r>
     </w:p>
@@ -7492,7 +7473,6 @@
         <w:rPr>
           <w:rFonts w:ascii="Arial" w:hAnsi="Arial" w:cs="Arial"/>
         </w:rPr>
-        <w:lastRenderedPageBreak/>
         <w:t>Fitting the model to the task</w:t>
       </w:r>
     </w:p>
@@ -7763,7 +7743,6 @@
         <w:rPr>
           <w:rFonts w:ascii="Arial" w:hAnsi="Arial" w:cs="Arial"/>
         </w:rPr>
-        <w:lastRenderedPageBreak/>
         <w:t>rediscovering the layout. The README and /docs structure</w:t>
       </w:r>
       <w:r>
@@ -8200,7 +8179,6 @@
         <w:rPr>
           <w:rFonts w:ascii="Arial" w:hAnsi="Arial" w:cs="Arial"/>
         </w:rPr>
-        <w:lastRenderedPageBreak/>
         <w:t>References</w:t>
       </w:r>
     </w:p>
@@ -8650,7 +8628,6 @@
         <w:rPr>
           <w:rFonts w:ascii="Arial" w:hAnsi="Arial" w:cs="Arial"/>
         </w:rPr>
-        <w:lastRenderedPageBreak/>
         <w:t>8. Governing Principles</w:t>
       </w:r>
     </w:p>
@@ -8991,13 +8968,7 @@
         <w:rPr>
           <w:rFonts w:ascii="Arial" w:hAnsi="Arial" w:cs="Arial"/>
         </w:rPr>
-        <w:t>Approve</w:t>
-      </w:r>
-      <w:r>
-        <w:rPr>
-          <w:rFonts w:ascii="Arial" w:hAnsi="Arial" w:cs="Arial"/>
-        </w:rPr>
-        <w:t xml:space="preserve"> a Pull Request.</w:t>
+        <w:t>Approve a Pull Request.</w:t>
       </w:r>
     </w:p>
     <w:p>
@@ -9195,7 +9166,6 @@
         <w:rPr>
           <w:rFonts w:ascii="Arial" w:hAnsi="Arial" w:cs="Arial"/>
         </w:rPr>
-        <w:lastRenderedPageBreak/>
         <w:t>Decide that a failed mandatory check can be ignored.</w:t>
       </w:r>
     </w:p>
@@ -9437,13 +9407,7 @@
         <w:rPr>
           <w:rFonts w:ascii="Arial" w:hAnsi="Arial" w:cs="Arial"/>
         </w:rPr>
-        <w:t>Writing</w:t>
-      </w:r>
-      <w:r>
-        <w:rPr>
-          <w:rFonts w:ascii="Arial" w:hAnsi="Arial" w:cs="Arial"/>
-        </w:rPr>
-        <w:t xml:space="preserve"> access does not imply merge authority.</w:t>
+        <w:t>Writing access does not imply merge authority.</w:t>
       </w:r>
     </w:p>
     <w:p>
@@ -9630,7 +9594,6 @@
         <w:rPr>
           <w:rFonts w:ascii="Arial" w:hAnsi="Arial" w:cs="Arial"/>
         </w:rPr>
-        <w:lastRenderedPageBreak/>
         <w:t>9. Operational Boundaries: Where AI Fits and Where It Should Not Decide</w:t>
       </w:r>
     </w:p>
@@ -10032,7 +9995,6 @@
         <w:rPr>
           <w:rFonts w:ascii="Arial" w:hAnsi="Arial" w:cs="Arial"/>
         </w:rPr>
-        <w:lastRenderedPageBreak/>
         <w:t>Proposed hard limits</w:t>
       </w:r>
     </w:p>
@@ -10319,7 +10281,6 @@
         <w:rPr>
           <w:rFonts w:ascii="Arial" w:hAnsi="Arial" w:cs="Arial"/>
         </w:rPr>
-        <w:lastRenderedPageBreak/>
         <w:t>Handling a boundary conflict</w:t>
       </w:r>
     </w:p>
@@ -10402,7 +10363,6 @@
         <w:rPr>
           <w:rFonts w:ascii="Arial" w:hAnsi="Arial" w:cs="Arial"/>
         </w:rPr>
-        <w:lastRenderedPageBreak/>
         <w:t>10. Human-in-the-Loop Framework: The Engineer's Role</w:t>
       </w:r>
     </w:p>
@@ -10457,6 +10417,7 @@
       <w:r>
         <w:rPr>
           <w:rFonts w:ascii="Arial" w:hAnsi="Arial" w:cs="Arial"/>
+          <w:noProof/>
         </w:rPr>
         <w:drawing>
           <wp:inline distT="0" distB="0" distL="0" distR="0" wp14:anchorId="2BF0BD67" wp14:editId="0BF41C5A">
@@ -10526,7 +10487,6 @@
         <w:rPr>
           <w:rFonts w:ascii="Arial" w:hAnsi="Arial" w:cs="Arial"/>
         </w:rPr>
-        <w:lastRenderedPageBreak/>
         <w:t xml:space="preserve">Design and </w:t>
       </w:r>
       <w:r>
@@ -10735,7 +10695,6 @@
         <w:rPr>
           <w:rFonts w:ascii="Arial" w:hAnsi="Arial" w:cs="Arial"/>
         </w:rPr>
-        <w:lastRenderedPageBreak/>
         <w:t>11. AI Autonomy Levels</w:t>
       </w:r>
     </w:p>
@@ -11122,7 +11081,6 @@
         <w:rPr>
           <w:rFonts w:ascii="Arial" w:hAnsi="Arial" w:cs="Arial"/>
         </w:rPr>
-        <w:lastRenderedPageBreak/>
         <w:t>Level 2 — Isolated Branch Agent</w:t>
       </w:r>
     </w:p>
@@ -11507,7 +11465,6 @@
         <w:rPr>
           <w:rFonts w:ascii="Arial" w:hAnsi="Arial" w:cs="Arial"/>
         </w:rPr>
-        <w:lastRenderedPageBreak/>
         <w:t>12. Repository as Engineering Source of Truth</w:t>
       </w:r>
     </w:p>
@@ -11633,6 +11590,11 @@
           <w:rFonts w:ascii="Arial" w:hAnsi="Arial" w:cs="Arial"/>
         </w:rPr>
         <w:br/>
+      </w:r>
+      <w:r>
+        <w:rPr>
+          <w:rFonts w:ascii="Arial" w:hAnsi="Arial" w:cs="Arial"/>
+        </w:rPr>
         <w:t>│   ├── operations/</w:t>
       </w:r>
       <w:r>
@@ -11972,7 +11934,6 @@
         <w:rPr>
           <w:rFonts w:ascii="Arial" w:hAnsi="Arial" w:cs="Arial"/>
         </w:rPr>
-        <w:lastRenderedPageBreak/>
         <w:t>External integrations.</w:t>
       </w:r>
     </w:p>
@@ -12338,7 +12299,12 @@
           <w:rFonts w:ascii="Arial" w:hAnsi="Arial" w:cs="Arial"/>
         </w:rPr>
         <w:br/>
-        <w:t>/docs/integration/mission-control.md</w:t>
+      </w:r>
+      <w:r>
+        <w:rPr>
+          <w:rFonts w:ascii="Arial" w:hAnsi="Arial" w:cs="Arial"/>
+        </w:rPr>
+        <w:t>/docs/integration/external-systems.md</w:t>
       </w:r>
     </w:p>
     <w:p>
@@ -12353,7 +12319,6 @@
         <w:rPr>
           <w:rFonts w:ascii="Arial" w:hAnsi="Arial" w:cs="Arial"/>
         </w:rPr>
-        <w:lastRenderedPageBreak/>
         <w:t>14. README</w:t>
       </w:r>
     </w:p>
@@ -12741,7 +12706,6 @@
         <w:rPr>
           <w:rFonts w:ascii="Arial" w:hAnsi="Arial" w:cs="Arial"/>
         </w:rPr>
-        <w:lastRenderedPageBreak/>
         <w:t>15. Architecture Decision Records</w:t>
       </w:r>
     </w:p>
@@ -13185,7 +13149,6 @@
         <w:rPr>
           <w:rFonts w:ascii="Arial" w:hAnsi="Arial" w:cs="Arial"/>
         </w:rPr>
-        <w:lastRenderedPageBreak/>
         <w:t>16. Architecture Guardrails</w:t>
       </w:r>
     </w:p>
@@ -13617,7 +13580,6 @@
         <w:rPr>
           <w:rFonts w:ascii="Arial" w:hAnsi="Arial" w:cs="Arial"/>
         </w:rPr>
-        <w:lastRenderedPageBreak/>
         <w:t>17. Versioned AI Engineering Instructions</w:t>
       </w:r>
     </w:p>
@@ -13678,6 +13640,11 @@
           <w:rFonts w:ascii="Arial" w:hAnsi="Arial" w:cs="Arial"/>
         </w:rPr>
         <w:br/>
+      </w:r>
+      <w:r>
+        <w:rPr>
+          <w:rFonts w:ascii="Arial" w:hAnsi="Arial" w:cs="Arial"/>
+        </w:rPr>
         <w:t>├── backend-development.md</w:t>
       </w:r>
       <w:r>
@@ -14089,7 +14056,6 @@
         <w:rPr>
           <w:rFonts w:ascii="Arial" w:hAnsi="Arial" w:cs="Arial"/>
         </w:rPr>
-        <w:lastRenderedPageBreak/>
         <w:t>18. Private AI Configuration</w:t>
       </w:r>
     </w:p>
@@ -14483,7 +14449,6 @@
         <w:rPr>
           <w:rFonts w:ascii="Arial" w:hAnsi="Arial" w:cs="Arial"/>
         </w:rPr>
-        <w:lastRenderedPageBreak/>
         <w:t>19. AI Context Boundary</w:t>
       </w:r>
     </w:p>
@@ -14797,7 +14762,6 @@
         <w:rPr>
           <w:rFonts w:ascii="Arial" w:hAnsi="Arial" w:cs="Arial"/>
         </w:rPr>
-        <w:lastRenderedPageBreak/>
         <w:t>20. Context-Informed Prompting Protocol</w:t>
       </w:r>
     </w:p>
@@ -15082,6 +15046,11 @@
           <w:rFonts w:ascii="Arial" w:hAnsi="Arial" w:cs="Arial"/>
         </w:rPr>
         <w:br/>
+      </w:r>
+      <w:r>
+        <w:rPr>
+          <w:rFonts w:ascii="Arial" w:hAnsi="Arial" w:cs="Arial"/>
+        </w:rPr>
         <w:t>- Publish all state changes through the existing IEventBus abstraction.</w:t>
       </w:r>
       <w:r>
@@ -15158,7 +15127,6 @@
         <w:rPr>
           <w:rFonts w:ascii="Arial" w:hAnsi="Arial" w:cs="Arial"/>
         </w:rPr>
-        <w:lastRenderedPageBreak/>
         <w:t>Decomposition, and feature-scale work</w:t>
       </w:r>
     </w:p>
@@ -15238,13 +15206,7 @@
         <w:rPr>
           <w:rFonts w:ascii="Arial" w:hAnsi="Arial" w:cs="Arial"/>
         </w:rPr>
-        <w:t>Engineer</w:t>
-      </w:r>
-      <w:r>
-        <w:rPr>
-          <w:rFonts w:ascii="Arial" w:hAnsi="Arial" w:cs="Arial"/>
-        </w:rPr>
-        <w:t xml:space="preserve"> establishes the requirement, the acceptance criteria and the architectural constraints.</w:t>
+        <w:t>Engineer establishes the requirement, the acceptance criteria and the architectural constraints.</w:t>
       </w:r>
     </w:p>
     <w:p>
@@ -15604,7 +15566,6 @@
           <w:rFonts w:ascii="Arial" w:hAnsi="Arial" w:cs="Arial"/>
           <w:b/>
         </w:rPr>
-        <w:lastRenderedPageBreak/>
         <w:t>Generated artifacts are a separate case.</w:t>
       </w:r>
       <w:r>
@@ -15783,7 +15744,6 @@
         <w:rPr>
           <w:rFonts w:ascii="Arial" w:hAnsi="Arial" w:cs="Arial"/>
         </w:rPr>
-        <w:lastRenderedPageBreak/>
         <w:t>21. Agentic Security Boundary</w:t>
       </w:r>
     </w:p>
@@ -16212,14 +16172,7 @@
         <w:rPr>
           <w:rFonts w:ascii="Arial" w:hAnsi="Arial" w:cs="Arial"/>
         </w:rPr>
-        <w:t xml:space="preserve"> information that is non-sensitive in isolation may become sensitive when combined with other information. AI context MUST </w:t>
-      </w:r>
-      <w:r>
-        <w:rPr>
-          <w:rFonts w:ascii="Arial" w:hAnsi="Arial" w:cs="Arial"/>
-        </w:rPr>
-        <w:lastRenderedPageBreak/>
-        <w:t>therefore be evaluated cumulatively, not prompt by prompt.</w:t>
+        <w:t xml:space="preserve"> information that is non-sensitive in isolation may become sensitive when combined with other information. AI context MUST therefore be evaluated cumulatively, not prompt by prompt.</w:t>
       </w:r>
     </w:p>
     <w:p>
@@ -16638,7 +16591,6 @@
         <w:rPr>
           <w:rFonts w:ascii="Arial" w:hAnsi="Arial" w:cs="Arial"/>
         </w:rPr>
-        <w:lastRenderedPageBreak/>
         <w:t>Protected information</w:t>
       </w:r>
     </w:p>
@@ -17090,7 +17042,6 @@
           <w:rFonts w:ascii="Arial" w:hAnsi="Arial" w:cs="Arial"/>
           <w:b/>
         </w:rPr>
-        <w:lastRenderedPageBreak/>
         <w:t>Cumulatively sensitive</w:t>
       </w:r>
       <w:r>
@@ -17392,7 +17343,6 @@
         <w:rPr>
           <w:rFonts w:ascii="Arial" w:hAnsi="Arial" w:cs="Arial"/>
         </w:rPr>
-        <w:lastRenderedPageBreak/>
         <w:t>Work that touches core industrial know-how, patent-sensitive material or confidential customer solutions SHOULD be scoped explicitly before an assistant is involved, so that the decision about what may enter the context is made once and deliberately rather than incrementally under delivery pressure.</w:t>
       </w:r>
     </w:p>
@@ -17622,7 +17572,6 @@
         <w:rPr>
           <w:rFonts w:ascii="Arial" w:hAnsi="Arial" w:cs="Arial"/>
         </w:rPr>
-        <w:lastRenderedPageBreak/>
         <w:br w:type="page"/>
       </w:r>
     </w:p>
@@ -17638,7 +17587,6 @@
         <w:rPr>
           <w:rFonts w:ascii="Arial" w:hAnsi="Arial" w:cs="Arial"/>
         </w:rPr>
-        <w:lastRenderedPageBreak/>
         <w:t>23. Local Models and Organization-Owned Agentic Tooling</w:t>
       </w:r>
     </w:p>
@@ -17790,6 +17738,11 @@
           <w:rFonts w:ascii="Arial" w:hAnsi="Arial" w:cs="Arial"/>
         </w:rPr>
         <w:br/>
+      </w:r>
+      <w:r>
+        <w:rPr>
+          <w:rFonts w:ascii="Arial" w:hAnsi="Arial" w:cs="Arial"/>
+        </w:rPr>
         <w:t xml:space="preserve">        ENG["Engineer&lt;br/&gt;corporate identity"]</w:t>
       </w:r>
       <w:r>
@@ -17867,6 +17820,11 @@
           <w:rFonts w:ascii="Arial" w:hAnsi="Arial" w:cs="Arial"/>
         </w:rPr>
         <w:br/>
+      </w:r>
+      <w:r>
+        <w:rPr>
+          <w:rFonts w:ascii="Arial" w:hAnsi="Arial" w:cs="Arial"/>
+        </w:rPr>
         <w:t xml:space="preserve">    AG -. "no context leaves without explicit authorization" .-&gt; EXT</w:t>
       </w:r>
       <w:r>
@@ -17904,14 +17862,7 @@
         <w:rPr>
           <w:rFonts w:ascii="Arial" w:hAnsi="Arial" w:cs="Arial"/>
         </w:rPr>
-        <w:t xml:space="preserve">Such an ecosystem SHOULD be treated as engineering infrastructure: designed, reviewed, </w:t>
-      </w:r>
-      <w:r>
-        <w:rPr>
-          <w:rFonts w:ascii="Arial" w:hAnsi="Arial" w:cs="Arial"/>
-        </w:rPr>
-        <w:lastRenderedPageBreak/>
-        <w:t>versioned and operated, not assembled ad hoc on individual workstations.</w:t>
+        <w:t>Such an ecosystem SHOULD be treated as engineering infrastructure: designed, reviewed, versioned and operated, not assembled ad hoc on individual workstations.</w:t>
       </w:r>
     </w:p>
     <w:p>
@@ -18171,14 +18122,7 @@
         <w:rPr>
           <w:rFonts w:ascii="Arial" w:hAnsi="Arial" w:cs="Arial"/>
         </w:rPr>
-        <w:t xml:space="preserve">Access SHOULD be scoped to specific repositories and branch patterns rather than to an organization as a whole. Cross-repository reach remains a privileged operation, </w:t>
-      </w:r>
-      <w:r>
-        <w:rPr>
-          <w:rFonts w:ascii="Arial" w:hAnsi="Arial" w:cs="Arial"/>
-        </w:rPr>
-        <w:lastRenderedPageBreak/>
-        <w:t>for the reasons given in section 21.</w:t>
+        <w:t>Access SHOULD be scoped to specific repositories and branch patterns rather than to an organization as a whole. Cross-repository reach remains a privileged operation, for the reasons given in section 21.</w:t>
       </w:r>
     </w:p>
     <w:p>
@@ -18387,7 +18331,6 @@
         <w:rPr>
           <w:rFonts w:ascii="Arial" w:hAnsi="Arial" w:cs="Arial"/>
         </w:rPr>
-        <w:lastRenderedPageBreak/>
         <w:t>Egress and exfiltration control</w:t>
       </w:r>
     </w:p>
@@ -18670,7 +18613,6 @@
         <w:rPr>
           <w:rFonts w:ascii="Arial" w:hAnsi="Arial" w:cs="Arial"/>
         </w:rPr>
-        <w:lastRenderedPageBreak/>
         <w:t>The tooling is itself a dependency</w:t>
       </w:r>
     </w:p>
@@ -18909,7 +18851,6 @@
         <w:rPr>
           <w:rFonts w:ascii="Arial" w:hAnsi="Arial" w:cs="Arial"/>
         </w:rPr>
-        <w:lastRenderedPageBreak/>
         <w:t>What this does not change</w:t>
       </w:r>
     </w:p>
@@ -19128,7 +19069,6 @@
         <w:rPr>
           <w:rFonts w:ascii="Arial" w:hAnsi="Arial" w:cs="Arial"/>
         </w:rPr>
-        <w:lastRenderedPageBreak/>
         <w:t>24. Dependency Governance</w:t>
       </w:r>
     </w:p>
@@ -19457,7 +19397,6 @@
         <w:rPr>
           <w:rFonts w:ascii="Arial" w:hAnsi="Arial" w:cs="Arial"/>
         </w:rPr>
-        <w:lastRenderedPageBreak/>
         <w:t>25. Implementation Planning</w:t>
       </w:r>
     </w:p>
@@ -19989,7 +19928,6 @@
         <w:rPr>
           <w:rFonts w:ascii="Arial" w:hAnsi="Arial" w:cs="Arial"/>
         </w:rPr>
-        <w:lastRenderedPageBreak/>
         <w:t>Failure scenarios.</w:t>
       </w:r>
     </w:p>
@@ -20156,6 +20094,7 @@
       <w:r>
         <w:rPr>
           <w:rFonts w:ascii="Arial" w:hAnsi="Arial" w:cs="Arial"/>
+          <w:noProof/>
         </w:rPr>
         <w:drawing>
           <wp:inline distT="0" distB="0" distL="0" distR="0" wp14:anchorId="03084A11" wp14:editId="5E67B11E">
@@ -20226,6 +20165,7 @@
       <w:r>
         <w:rPr>
           <w:rFonts w:ascii="Arial" w:hAnsi="Arial" w:cs="Arial"/>
+          <w:noProof/>
         </w:rPr>
         <w:drawing>
           <wp:inline distT="0" distB="0" distL="0" distR="0" wp14:anchorId="426F1828" wp14:editId="2F0BB345">
@@ -20328,7 +20268,6 @@
         <w:rPr>
           <w:rFonts w:ascii="Arial" w:hAnsi="Arial" w:cs="Arial"/>
         </w:rPr>
-        <w:lastRenderedPageBreak/>
         <w:t>27. Verification Independence</w:t>
       </w:r>
     </w:p>
@@ -20712,7 +20651,6 @@
         <w:rPr>
           <w:rFonts w:ascii="Arial" w:hAnsi="Arial" w:cs="Arial"/>
         </w:rPr>
-        <w:lastRenderedPageBreak/>
         <w:t>28. Risk-Based Test Portfolio</w:t>
       </w:r>
     </w:p>
@@ -21017,7 +20955,6 @@
         <w:rPr>
           <w:rFonts w:ascii="Arial" w:hAnsi="Arial" w:cs="Arial"/>
         </w:rPr>
-        <w:lastRenderedPageBreak/>
         <w:t>29. Unit Tests</w:t>
       </w:r>
     </w:p>
@@ -21267,7 +21204,6 @@
         <w:rPr>
           <w:rFonts w:ascii="Arial" w:hAnsi="Arial" w:cs="Arial"/>
         </w:rPr>
-        <w:lastRenderedPageBreak/>
         <w:t>30. Integration Tests and Real Dependencies</w:t>
       </w:r>
     </w:p>
@@ -21570,7 +21506,6 @@
         <w:rPr>
           <w:rFonts w:ascii="Arial" w:hAnsi="Arial" w:cs="Arial"/>
         </w:rPr>
-        <w:lastRenderedPageBreak/>
         <w:t>31. Contract Testing</w:t>
       </w:r>
     </w:p>
@@ -22021,7 +21956,6 @@
         <w:rPr>
           <w:rFonts w:ascii="Arial" w:hAnsi="Arial" w:cs="Arial"/>
         </w:rPr>
-        <w:lastRenderedPageBreak/>
         <w:t>33. Test Maintenance</w:t>
       </w:r>
     </w:p>
@@ -22391,7 +22325,6 @@
         <w:rPr>
           <w:rFonts w:ascii="Arial" w:hAnsi="Arial" w:cs="Arial"/>
         </w:rPr>
-        <w:lastRenderedPageBreak/>
         <w:t>34. AI-Assisted Test Generation</w:t>
       </w:r>
     </w:p>
@@ -22757,7 +22690,6 @@
         <w:rPr>
           <w:rFonts w:ascii="Arial" w:hAnsi="Arial" w:cs="Arial"/>
         </w:rPr>
-        <w:lastRenderedPageBreak/>
         <w:t>35. AI-Generated Mock and Synthetic Test Data</w:t>
       </w:r>
     </w:p>
@@ -23066,7 +22998,6 @@
         <w:rPr>
           <w:rFonts w:ascii="Arial" w:hAnsi="Arial" w:cs="Arial"/>
         </w:rPr>
-        <w:lastRenderedPageBreak/>
         <w:t>36. Synthetic Data Safety Rules</w:t>
       </w:r>
     </w:p>
@@ -23338,7 +23269,6 @@
         <w:rPr>
           <w:rFonts w:ascii="Arial" w:hAnsi="Arial" w:cs="Arial"/>
         </w:rPr>
-        <w:lastRenderedPageBreak/>
         <w:t>37. Synthetic Data Provenance</w:t>
       </w:r>
     </w:p>
@@ -23390,6 +23320,11 @@
           <w:rFonts w:ascii="Arial" w:hAnsi="Arial" w:cs="Arial"/>
         </w:rPr>
         <w:br/>
+      </w:r>
+      <w:r>
+        <w:rPr>
+          <w:rFonts w:ascii="Arial" w:hAnsi="Arial" w:cs="Arial"/>
+        </w:rPr>
         <w:t>generator version</w:t>
       </w:r>
       <w:r>
@@ -23586,7 +23521,6 @@
         <w:rPr>
           <w:rFonts w:ascii="Arial" w:hAnsi="Arial" w:cs="Arial"/>
         </w:rPr>
-        <w:lastRenderedPageBreak/>
         <w:t>38. Scenario-Based Test Data</w:t>
       </w:r>
     </w:p>
@@ -23784,7 +23718,6 @@
         <w:rPr>
           <w:rFonts w:ascii="Arial" w:hAnsi="Arial" w:cs="Arial"/>
         </w:rPr>
-        <w:lastRenderedPageBreak/>
         <w:t>39. Synthetic Data Validation</w:t>
       </w:r>
     </w:p>
@@ -24040,7 +23973,6 @@
         <w:rPr>
           <w:rFonts w:ascii="Arial" w:hAnsi="Arial" w:cs="Arial"/>
         </w:rPr>
-        <w:lastRenderedPageBreak/>
         <w:t>40. Golden and Regression Datasets</w:t>
       </w:r>
     </w:p>
@@ -24326,7 +24258,6 @@
         <w:rPr>
           <w:rFonts w:ascii="Arial" w:hAnsi="Arial" w:cs="Arial"/>
         </w:rPr>
-        <w:lastRenderedPageBreak/>
         <w:t>41. Property-Based and Invariant Testing</w:t>
       </w:r>
     </w:p>
@@ -24410,6 +24341,11 @@
           <w:rFonts w:ascii="Arial" w:hAnsi="Arial" w:cs="Arial"/>
         </w:rPr>
         <w:br/>
+      </w:r>
+      <w:r>
+        <w:rPr>
+          <w:rFonts w:ascii="Arial" w:hAnsi="Arial" w:cs="Arial"/>
+        </w:rPr>
         <w:t>migration preserves all valid entities</w:t>
       </w:r>
     </w:p>
@@ -24547,7 +24483,6 @@
         <w:rPr>
           <w:rFonts w:ascii="Arial" w:hAnsi="Arial" w:cs="Arial"/>
         </w:rPr>
-        <w:lastRenderedPageBreak/>
         <w:t>43. Test Harnesses</w:t>
       </w:r>
     </w:p>
@@ -25012,7 +24947,6 @@
         <w:rPr>
           <w:rFonts w:ascii="Arial" w:hAnsi="Arial" w:cs="Arial"/>
         </w:rPr>
-        <w:lastRenderedPageBreak/>
         <w:t>44. Harness Independence</w:t>
       </w:r>
     </w:p>
@@ -25464,7 +25398,6 @@
         <w:rPr>
           <w:rFonts w:ascii="Arial" w:hAnsi="Arial" w:cs="Arial"/>
         </w:rPr>
-        <w:lastRenderedPageBreak/>
         <w:t>46. Automated Quality Gates: Proposed Model</w:t>
       </w:r>
     </w:p>
@@ -25494,6 +25427,7 @@
       <w:r>
         <w:rPr>
           <w:rFonts w:ascii="Arial" w:hAnsi="Arial" w:cs="Arial"/>
+          <w:noProof/>
         </w:rPr>
         <w:drawing>
           <wp:inline distT="0" distB="0" distL="0" distR="0" wp14:anchorId="5EA39808" wp14:editId="2598D8A2">
@@ -25585,7 +25519,6 @@
         <w:rPr>
           <w:rFonts w:ascii="Arial" w:hAnsi="Arial" w:cs="Arial"/>
         </w:rPr>
-        <w:lastRenderedPageBreak/>
         <w:t>Suggested branch protection</w:t>
       </w:r>
     </w:p>
@@ -26009,7 +25942,6 @@
         <w:rPr>
           <w:rFonts w:ascii="Arial" w:hAnsi="Arial" w:cs="Arial"/>
         </w:rPr>
-        <w:lastRenderedPageBreak/>
         <w:t>Thresholds</w:t>
       </w:r>
     </w:p>
@@ -26119,7 +26051,6 @@
         <w:rPr>
           <w:rFonts w:ascii="Arial" w:hAnsi="Arial" w:cs="Arial"/>
         </w:rPr>
-        <w:lastRenderedPageBreak/>
         <w:t>47. Clean Code Requirements</w:t>
       </w:r>
     </w:p>
@@ -26565,7 +26496,6 @@
         <w:rPr>
           <w:rFonts w:ascii="Arial" w:hAnsi="Arial" w:cs="Arial"/>
         </w:rPr>
-        <w:lastRenderedPageBreak/>
         <w:t>48. Security Verification</w:t>
       </w:r>
     </w:p>
@@ -26874,7 +26804,6 @@
         <w:rPr>
           <w:rFonts w:ascii="Arial" w:hAnsi="Arial" w:cs="Arial"/>
         </w:rPr>
-        <w:lastRenderedPageBreak/>
         <w:t>49. Threat Modeling</w:t>
       </w:r>
     </w:p>
@@ -27284,7 +27213,6 @@
         <w:rPr>
           <w:rFonts w:ascii="Arial" w:hAnsi="Arial" w:cs="Arial"/>
         </w:rPr>
-        <w:lastRenderedPageBreak/>
         <w:t>50. Software Supply Chain</w:t>
       </w:r>
     </w:p>
@@ -27689,6 +27617,9 @@
         <w:pStyle w:val="Textoindependiente"/>
       </w:pPr>
       <w:r>
+        <w:rPr>
+          <w:noProof/>
+        </w:rPr>
         <w:drawing>
           <wp:inline distT="0" distB="0" distL="0" distR="0" wp14:anchorId="1342EC3F" wp14:editId="3E08B185">
             <wp:extent cx="6120130" cy="443865"/>
@@ -27738,7 +27669,6 @@
         <w:rPr>
           <w:rFonts w:ascii="Arial" w:hAnsi="Arial" w:cs="Arial"/>
         </w:rPr>
-        <w:lastRenderedPageBreak/>
         <w:t>52. Observability</w:t>
       </w:r>
     </w:p>
@@ -28230,7 +28160,6 @@
         <w:rPr>
           <w:rFonts w:ascii="Arial" w:hAnsi="Arial" w:cs="Arial"/>
         </w:rPr>
-        <w:lastRenderedPageBreak/>
         <w:t>54. Database Changes</w:t>
       </w:r>
     </w:p>
@@ -28623,7 +28552,6 @@
         <w:rPr>
           <w:rFonts w:ascii="Arial" w:hAnsi="Arial" w:cs="Arial"/>
         </w:rPr>
-        <w:lastRenderedPageBreak/>
         <w:t>56. AI Contribution Traceability: Options</w:t>
       </w:r>
     </w:p>
@@ -28929,7 +28857,6 @@
         <w:rPr>
           <w:rFonts w:ascii="Arial" w:hAnsi="Arial" w:cs="Arial"/>
         </w:rPr>
-        <w:lastRenderedPageBreak/>
         <w:t>57. AI Review as Additional Review</w:t>
       </w:r>
     </w:p>
@@ -29428,7 +29355,6 @@
         <w:rPr>
           <w:rFonts w:ascii="Arial" w:hAnsi="Arial" w:cs="Arial"/>
         </w:rPr>
-        <w:lastRenderedPageBreak/>
         <w:t>No secrets are introduced.</w:t>
       </w:r>
     </w:p>
@@ -29637,7 +29563,6 @@
         <w:rPr>
           <w:rFonts w:ascii="Arial" w:hAnsi="Arial" w:cs="Arial"/>
         </w:rPr>
-        <w:lastRenderedPageBreak/>
         <w:t>60. Pull Request Checklist</w:t>
       </w:r>
     </w:p>
@@ -29717,6 +29642,11 @@
           <w:rFonts w:ascii="Arial" w:hAnsi="Arial" w:cs="Arial"/>
         </w:rPr>
         <w:br/>
+      </w:r>
+      <w:r>
+        <w:rPr>
+          <w:rFonts w:ascii="Arial" w:hAnsi="Arial" w:cs="Arial"/>
+        </w:rPr>
         <w:t>[ ] Contract tests added where applicable</w:t>
       </w:r>
       <w:r>
@@ -29843,7 +29773,6 @@
         <w:rPr>
           <w:rFonts w:ascii="Arial" w:hAnsi="Arial" w:cs="Arial"/>
         </w:rPr>
-        <w:lastRenderedPageBreak/>
         <w:t>61. Human Review</w:t>
       </w:r>
     </w:p>
@@ -30363,7 +30292,6 @@
         <w:rPr>
           <w:rFonts w:ascii="Arial" w:hAnsi="Arial" w:cs="Arial"/>
         </w:rPr>
-        <w:lastRenderedPageBreak/>
         <w:t>62. Branch Management</w:t>
       </w:r>
     </w:p>
@@ -30406,6 +30334,7 @@
       <w:r>
         <w:rPr>
           <w:rFonts w:ascii="Arial" w:hAnsi="Arial" w:cs="Arial"/>
+          <w:noProof/>
         </w:rPr>
         <w:drawing>
           <wp:inline distT="0" distB="0" distL="0" distR="0" wp14:anchorId="3387CCCB" wp14:editId="7BC843AF">
@@ -30609,7 +30538,6 @@
         <w:rPr>
           <w:rFonts w:ascii="Arial" w:hAnsi="Arial" w:cs="Arial"/>
         </w:rPr>
-        <w:lastRenderedPageBreak/>
         <w:t>63. Recommended AI-Assisted Development Cycle</w:t>
       </w:r>
     </w:p>
@@ -30623,6 +30551,7 @@
       <w:r>
         <w:rPr>
           <w:rFonts w:ascii="Arial" w:hAnsi="Arial" w:cs="Arial"/>
+          <w:noProof/>
         </w:rPr>
         <w:drawing>
           <wp:inline distT="0" distB="0" distL="0" distR="0" wp14:anchorId="39C98552" wp14:editId="61E59865">
@@ -30731,6 +30660,7 @@
       <w:r>
         <w:rPr>
           <w:rFonts w:ascii="Arial" w:hAnsi="Arial" w:cs="Arial"/>
+          <w:noProof/>
         </w:rPr>
         <w:drawing>
           <wp:inline distT="0" distB="0" distL="0" distR="0" wp14:anchorId="160BEF48" wp14:editId="27267AD2">
@@ -30794,7 +30724,6 @@
         <w:rPr>
           <w:rFonts w:ascii="Arial" w:hAnsi="Arial" w:cs="Arial"/>
         </w:rPr>
-        <w:lastRenderedPageBreak/>
         <w:t>65. Definition of Done</w:t>
       </w:r>
     </w:p>
@@ -30839,6 +30768,7 @@
       <w:r>
         <w:rPr>
           <w:rFonts w:ascii="Arial" w:hAnsi="Arial" w:cs="Arial"/>
+          <w:noProof/>
         </w:rPr>
         <w:drawing>
           <wp:inline distT="0" distB="0" distL="0" distR="0" wp14:anchorId="4BF48054" wp14:editId="244A74F5">
@@ -30919,7 +30849,6 @@
         <w:rPr>
           <w:rFonts w:ascii="Arial" w:hAnsi="Arial" w:cs="Arial"/>
         </w:rPr>
-        <w:lastRenderedPageBreak/>
         <w:t>66. Metrics</w:t>
       </w:r>
     </w:p>
@@ -31316,7 +31245,6 @@
         <w:rPr>
           <w:rFonts w:ascii="Arial" w:hAnsi="Arial" w:cs="Arial"/>
         </w:rPr>
-        <w:lastRenderedPageBreak/>
         <w:t>67. Periodic AI Governance Review</w:t>
       </w:r>
     </w:p>
@@ -31621,7 +31549,6 @@
         <w:rPr>
           <w:rFonts w:ascii="Arial" w:hAnsi="Arial" w:cs="Arial"/>
         </w:rPr>
-        <w:lastRenderedPageBreak/>
         <w:t>68. Proposed Compliance and Enforcement Model</w:t>
       </w:r>
     </w:p>
@@ -31954,7 +31881,6 @@
         <w:rPr>
           <w:rFonts w:ascii="Arial" w:hAnsi="Arial" w:cs="Arial"/>
         </w:rPr>
-        <w:lastRenderedPageBreak/>
         <w:t>Exceptions are time-bounded by design. An exception that never expires is a requirement nobody believed in, and the honest response is to change the requirement rather than to keep granting the exception.</w:t>
       </w:r>
     </w:p>
@@ -32297,7 +32223,6 @@
         <w:rPr>
           <w:rFonts w:ascii="Arial" w:hAnsi="Arial" w:cs="Arial"/>
         </w:rPr>
-        <w:lastRenderedPageBreak/>
         <w:t>69. Engineering Governance Model</w:t>
       </w:r>
     </w:p>
@@ -32326,6 +32251,7 @@
       <w:r>
         <w:rPr>
           <w:rFonts w:ascii="Arial" w:hAnsi="Arial" w:cs="Arial"/>
+          <w:noProof/>
         </w:rPr>
         <w:drawing>
           <wp:inline distT="0" distB="0" distL="0" distR="0" wp14:anchorId="2EADA5FE" wp14:editId="5865DBA2">
@@ -32409,7 +32335,6 @@
         <w:rPr>
           <w:rFonts w:ascii="Arial" w:hAnsi="Arial" w:cs="Arial"/>
         </w:rPr>
-        <w:lastRenderedPageBreak/>
         <w:t>70. Final Principles</w:t>
       </w:r>
     </w:p>
@@ -32675,7 +32600,6 @@
         <w:rPr>
           <w:rFonts w:ascii="Arial" w:hAnsi="Arial" w:cs="Arial"/>
         </w:rPr>
-        <w:lastRenderedPageBreak/>
         <w:t>71. Open Questions and Decisions Required</w:t>
       </w:r>
     </w:p>
@@ -33002,7 +32926,13 @@
         <w:rPr>
           <w:rFonts w:ascii="Arial" w:hAnsi="Arial" w:cs="Arial"/>
         </w:rPr>
-        <w:t>If most development carries some degree of assistance within a couple of years, a boolean loses its information value. The alternative in the draft is to record the kind of intervention that actually matters for risk — substantial agent-generated change, generated tests, generated synthetic data, assisted migration, assisted security-sensitive code — rather than assistance in general. This needs agreement on the categories before it is put into a Pull Request template, otherwise it becomes noise that everybody ticks.</w:t>
+        <w:t>If most development carries some degree of assistance within a couple of years, a boolean loses its information value. The alternative in the draft is to record the kind of intervention that actually matters for risk — substantial agent-generated change, generated tests, generated synthetic data, assisted migration, assisted security-sensitive code — rather than assistance in general. This needs agreement on the categories before it is put into a Pull Request template, otherwise it becomes noise that everyb</w:t>
+      </w:r>
+      <w:r>
+        <w:rPr>
+          <w:rFonts w:ascii="Arial" w:hAnsi="Arial" w:cs="Arial"/>
+        </w:rPr>
+        <w:t>ody ticks.</w:t>
       </w:r>
     </w:p>
     <w:p>
@@ -33141,7 +33071,6 @@
         <w:rPr>
           <w:rFonts w:ascii="Arial" w:hAnsi="Arial" w:cs="Arial"/>
         </w:rPr>
-        <w:lastRenderedPageBreak/>
         <w:t>Q8 — Approved tooling and data handling</w:t>
       </w:r>
     </w:p>
@@ -33338,7 +33267,13 @@
         <w:rPr>
           <w:rFonts w:ascii="Arial" w:hAnsi="Arial" w:cs="Arial"/>
         </w:rPr>
-        <w:t>The conceptual-architecture section sketches identifiers such as ADR-0042 or SEC-0017, with relations like supersedes and applies-to, turning the documentation set into a versioned knowledge graph that both agents and Pull Requests can cite precisely. The open part is whether the discipline is worth its cost: an identifier scheme is cheap to start, useful only if maintained, and awkward to abandon once things reference each other. It also needs an owner, a numbering convention and a decision about what to do with the documents that already exist.</w:t>
+        <w:t>The conceptual-architecture section sketches identifiers such as ADR-0042 or SEC-0017, with relations like supersedes and applies-to, turning the documentation set into a versioned knowledge graph that both agents and Pull Requests can cite precisely. The open part is whether the discipline is worth its cost: an identifier scheme is cheap to start, useful only if maintained, and awkward to abandon once things reference each other. It also needs an owner, a numbering convention and a decision about what to d</w:t>
+      </w:r>
+      <w:r>
+        <w:rPr>
+          <w:rFonts w:ascii="Arial" w:hAnsi="Arial" w:cs="Arial"/>
+        </w:rPr>
+        <w:t>o with the documents that already exist.</w:t>
       </w:r>
     </w:p>
     <w:p>
@@ -33371,7 +33306,6 @@
         <w:rPr>
           <w:rFonts w:ascii="Arial" w:hAnsi="Arial" w:cs="Arial"/>
         </w:rPr>
-        <w:lastRenderedPageBreak/>
         <w:t>Q12 — Metrics and evidence of value</w:t>
       </w:r>
     </w:p>
@@ -33437,7 +33371,6 @@
         <w:rPr>
           <w:rFonts w:ascii="Arial" w:hAnsi="Arial" w:cs="Arial"/>
         </w:rPr>
-        <w:lastRenderedPageBreak/>
         <w:t>Part II — Implementation Profile</w:t>
       </w:r>
     </w:p>
@@ -33619,7 +33552,6 @@
         <w:rPr>
           <w:rFonts w:ascii="Arial" w:hAnsi="Arial" w:cs="Arial"/>
         </w:rPr>
-        <w:lastRenderedPageBreak/>
         <w:t>A. Frontend: Angular</w:t>
       </w:r>
     </w:p>
@@ -33710,6 +33642,11 @@
           <w:rFonts w:ascii="Arial" w:hAnsi="Arial" w:cs="Arial"/>
         </w:rPr>
         <w:br/>
+      </w:r>
+      <w:r>
+        <w:rPr>
+          <w:rFonts w:ascii="Arial" w:hAnsi="Arial" w:cs="Arial"/>
+        </w:rPr>
         <w:t>on:</w:t>
       </w:r>
       <w:r>
@@ -33874,6 +33811,11 @@
           <w:rFonts w:ascii="Arial" w:hAnsi="Arial" w:cs="Arial"/>
         </w:rPr>
         <w:br/>
+      </w:r>
+      <w:r>
+        <w:rPr>
+          <w:rFonts w:ascii="Arial" w:hAnsi="Arial" w:cs="Arial"/>
+        </w:rPr>
         <w:t xml:space="preserve">          cache: 'npm'</w:t>
       </w:r>
       <w:r>
@@ -33967,12 +33909,6 @@
           <w:rFonts w:ascii="Arial" w:hAnsi="Arial" w:cs="Arial"/>
         </w:rPr>
         <w:br/>
-      </w:r>
-      <w:r>
-        <w:rPr>
-          <w:rFonts w:ascii="Arial" w:hAnsi="Arial" w:cs="Arial"/>
-        </w:rPr>
-        <w:lastRenderedPageBreak/>
         <w:t xml:space="preserve">      - name: Validate production AOT build</w:t>
       </w:r>
       <w:r>
@@ -34000,6 +33936,11 @@
           <w:rFonts w:ascii="Arial" w:hAnsi="Arial" w:cs="Arial"/>
         </w:rPr>
         <w:br/>
+      </w:r>
+      <w:r>
+        <w:rPr>
+          <w:rFonts w:ascii="Arial" w:hAnsi="Arial" w:cs="Arial"/>
+        </w:rPr>
         <w:t xml:space="preserve">        run: npm run test -- --watch=false --browsers=ChromeHeadless --code-coverage</w:t>
       </w:r>
       <w:r>
@@ -34089,6 +34030,11 @@
           <w:rFonts w:ascii="Arial" w:hAnsi="Arial" w:cs="Arial"/>
         </w:rPr>
         <w:br/>
+      </w:r>
+      <w:r>
+        <w:rPr>
+          <w:rFonts w:ascii="Arial" w:hAnsi="Arial" w:cs="Arial"/>
+        </w:rPr>
         <w:t xml:space="preserve">          SONAR_HOST_URL: ${{ secrets.SONAR_HOST_URL }}</w:t>
       </w:r>
     </w:p>
@@ -34154,20 +34100,13 @@
         <w:rPr>
           <w:rFonts w:ascii="Arial" w:hAnsi="Arial" w:cs="Arial"/>
         </w:rPr>
-        <w:lastRenderedPageBreak/>
-        <w:t>B. Backend</w:t>
-      </w:r>
-      <w:r>
-        <w:rPr>
-          <w:rFonts w:ascii="Arial" w:hAnsi="Arial" w:cs="Arial"/>
-        </w:rPr>
-        <w:t xml:space="preserve"> and Mission Control</w:t>
-      </w:r>
-      <w:r>
-        <w:rPr>
-          <w:rFonts w:ascii="Arial" w:hAnsi="Arial" w:cs="Arial"/>
-        </w:rPr>
-        <w:t>: .NET</w:t>
+        <w:t xml:space="preserve">B. </w:t>
+      </w:r>
+      <w:r>
+        <w:rPr>
+          <w:rFonts w:ascii="Arial" w:hAnsi="Arial" w:cs="Arial"/>
+        </w:rPr>
+        <w:t>Backend: .NET</w:t>
       </w:r>
     </w:p>
     <w:p>
@@ -34515,12 +34454,6 @@
           <w:rFonts w:ascii="Arial" w:hAnsi="Arial" w:cs="Arial"/>
         </w:rPr>
         <w:br/>
-      </w:r>
-      <w:r>
-        <w:rPr>
-          <w:rFonts w:ascii="Arial" w:hAnsi="Arial" w:cs="Arial"/>
-        </w:rPr>
-        <w:lastRenderedPageBreak/>
         <w:t xml:space="preserve">        run: dotnet format --verify-no-changes</w:t>
       </w:r>
       <w:r>
@@ -34548,6 +34481,11 @@
           <w:rFonts w:ascii="Arial" w:hAnsi="Arial" w:cs="Arial"/>
         </w:rPr>
         <w:br/>
+      </w:r>
+      <w:r>
+        <w:rPr>
+          <w:rFonts w:ascii="Arial" w:hAnsi="Arial" w:cs="Arial"/>
+        </w:rPr>
         <w:t xml:space="preserve">          dotnet sonarscanner begin</w:t>
       </w:r>
       <w:r>
@@ -34623,6 +34561,11 @@
           <w:rFonts w:ascii="Arial" w:hAnsi="Arial" w:cs="Arial"/>
         </w:rPr>
         <w:br/>
+      </w:r>
+      <w:r>
+        <w:rPr>
+          <w:rFonts w:ascii="Arial" w:hAnsi="Arial" w:cs="Arial"/>
+        </w:rPr>
         <w:t xml:space="preserve">          dotnet test --no-build --configuration Release --verbosity normal</w:t>
       </w:r>
       <w:r>
@@ -34705,6 +34648,11 @@
           <w:rFonts w:ascii="Arial" w:hAnsi="Arial" w:cs="Arial"/>
         </w:rPr>
         <w:br/>
+      </w:r>
+      <w:r>
+        <w:rPr>
+          <w:rFonts w:ascii="Arial" w:hAnsi="Arial" w:cs="Arial"/>
+        </w:rPr>
         <w:t xml:space="preserve">          SONAR_HOST_URL: ${{ secrets.SONAR_HOST_URL }}</w:t>
       </w:r>
     </w:p>
@@ -34760,7 +34708,6 @@
         <w:rPr>
           <w:rFonts w:ascii="Arial" w:hAnsi="Arial" w:cs="Arial"/>
         </w:rPr>
-        <w:lastRenderedPageBreak/>
         <w:t xml:space="preserve">C. </w:t>
       </w:r>
       <w:r>
@@ -34868,6 +34815,11 @@
           <w:rFonts w:ascii="Arial" w:hAnsi="Arial" w:cs="Arial"/>
         </w:rPr>
         <w:br/>
+      </w:r>
+      <w:r>
+        <w:rPr>
+          <w:rFonts w:ascii="Arial" w:hAnsi="Arial" w:cs="Arial"/>
+        </w:rPr>
         <w:t xml:space="preserve">  pull_request:</w:t>
       </w:r>
       <w:r>
@@ -35031,6 +34983,11 @@
           <w:rFonts w:ascii="Arial" w:hAnsi="Arial" w:cs="Arial"/>
         </w:rPr>
         <w:br/>
+      </w:r>
+      <w:r>
+        <w:rPr>
+          <w:rFonts w:ascii="Arial" w:hAnsi="Arial" w:cs="Arial"/>
+        </w:rPr>
         <w:t xml:space="preserve">      - name: Configure build and export the compilation database</w:t>
       </w:r>
       <w:r>
@@ -35105,6 +35062,11 @@
           <w:rFonts w:ascii="Arial" w:hAnsi="Arial" w:cs="Arial"/>
         </w:rPr>
         <w:br/>
+      </w:r>
+      <w:r>
+        <w:rPr>
+          <w:rFonts w:ascii="Arial" w:hAnsi="Arial" w:cs="Arial"/>
+        </w:rPr>
         <w:t xml:space="preserve">          cppcheck --project=build/compile_commands.json</w:t>
       </w:r>
       <w:r>
@@ -35126,12 +35088,6 @@
           <w:rFonts w:ascii="Arial" w:hAnsi="Arial" w:cs="Arial"/>
         </w:rPr>
         <w:br/>
-      </w:r>
-      <w:r>
-        <w:rPr>
-          <w:rFonts w:ascii="Arial" w:hAnsi="Arial" w:cs="Arial"/>
-        </w:rPr>
-        <w:lastRenderedPageBreak/>
         <w:t xml:space="preserve">          --suppress=missingIncludeSystem</w:t>
       </w:r>
       <w:r>
@@ -35199,6 +35155,11 @@
           <w:rFonts w:ascii="Arial" w:hAnsi="Arial" w:cs="Arial"/>
         </w:rPr>
         <w:br/>
+      </w:r>
+      <w:r>
+        <w:rPr>
+          <w:rFonts w:ascii="Arial" w:hAnsi="Arial" w:cs="Arial"/>
+        </w:rPr>
         <w:t xml:space="preserve">        uses: SonarSource/sonarqube-scan-action@v5</w:t>
       </w:r>
       <w:r>
@@ -35282,6 +35243,11 @@
           <w:rFonts w:ascii="Arial" w:hAnsi="Arial" w:cs="Arial"/>
         </w:rPr>
         <w:br/>
+      </w:r>
+      <w:r>
+        <w:rPr>
+          <w:rFonts w:ascii="Arial" w:hAnsi="Arial" w:cs="Arial"/>
+        </w:rPr>
         <w:t xml:space="preserve">          SONAR_HOST_URL: ${{ secrets.SONAR_HOST_URL }}</w:t>
       </w:r>
     </w:p>
@@ -35329,7 +35295,6 @@
         <w:rPr>
           <w:rFonts w:ascii="Arial" w:hAnsi="Arial" w:cs="Arial"/>
         </w:rPr>
-        <w:lastRenderedPageBreak/>
         <w:t>D. Automation</w:t>
       </w:r>
       <w:r>
@@ -35446,6 +35411,11 @@
           <w:rFonts w:ascii="Arial" w:hAnsi="Arial" w:cs="Arial"/>
         </w:rPr>
         <w:br/>
+      </w:r>
+      <w:r>
+        <w:rPr>
+          <w:rFonts w:ascii="Arial" w:hAnsi="Arial" w:cs="Arial"/>
+        </w:rPr>
         <w:t xml:space="preserve">    branches: [ main, develop ]</w:t>
       </w:r>
       <w:r>
@@ -35616,6 +35586,11 @@
           <w:rFonts w:ascii="Arial" w:hAnsi="Arial" w:cs="Arial"/>
         </w:rPr>
         <w:br/>
+      </w:r>
+      <w:r>
+        <w:rPr>
+          <w:rFonts w:ascii="Arial" w:hAnsi="Arial" w:cs="Arial"/>
+        </w:rPr>
         <w:t xml:space="preserve">        run: |</w:t>
       </w:r>
       <w:r>
@@ -35702,7 +35677,6 @@
         <w:rPr>
           <w:rFonts w:ascii="Arial" w:hAnsi="Arial" w:cs="Arial"/>
         </w:rPr>
-        <w:lastRenderedPageBreak/>
         <w:br/>
         <w:t xml:space="preserve">      - name: Security audit of source (Bandit)</w:t>
       </w:r>
@@ -35744,6 +35718,11 @@
           <w:rFonts w:ascii="Arial" w:hAnsi="Arial" w:cs="Arial"/>
         </w:rPr>
         <w:br/>
+      </w:r>
+      <w:r>
+        <w:rPr>
+          <w:rFonts w:ascii="Arial" w:hAnsi="Arial" w:cs="Arial"/>
+        </w:rPr>
         <w:t xml:space="preserve">      - name: Tests with coverage</w:t>
       </w:r>
       <w:r>
@@ -35840,6 +35819,11 @@
           <w:rFonts w:ascii="Arial" w:hAnsi="Arial" w:cs="Arial"/>
         </w:rPr>
         <w:br/>
+      </w:r>
+      <w:r>
+        <w:rPr>
+          <w:rFonts w:ascii="Arial" w:hAnsi="Arial" w:cs="Arial"/>
+        </w:rPr>
         <w:t xml:space="preserve">          SONAR_HOST_URL: ${{ secrets.SONAR_HOST_URL }}</w:t>
       </w:r>
     </w:p>
@@ -36035,7 +36019,6 @@
         <w:rPr>
           <w:rFonts w:ascii="Arial" w:hAnsi="Arial" w:cs="Arial"/>
         </w:rPr>
-        <w:lastRenderedPageBreak/>
         <w:t>Annex B — Proposed Quality Gate Baselines</w:t>
       </w:r>
     </w:p>
@@ -37120,7 +37103,6 @@
         <w:rPr>
           <w:rFonts w:ascii="Arial" w:hAnsi="Arial" w:cs="Arial"/>
         </w:rPr>
-        <w:lastRenderedPageBreak/>
         <w:t>Annex C — Draft Pull Request Declaration</w:t>
       </w:r>
     </w:p>
@@ -37398,6 +37380,11 @@
           <w:rFonts w:ascii="Arial" w:hAnsi="Arial" w:cs="Arial"/>
         </w:rPr>
         <w:br/>
+      </w:r>
+      <w:r>
+        <w:rPr>
+          <w:rFonts w:ascii="Arial" w:hAnsi="Arial" w:cs="Arial"/>
+        </w:rPr>
         <w:t>- [ ] AI-assisted change to security-sensitive code</w:t>
       </w:r>
       <w:r>
@@ -37472,12 +37459,6 @@
           <w:rFonts w:ascii="Arial" w:hAnsi="Arial" w:cs="Arial"/>
         </w:rPr>
         <w:br/>
-      </w:r>
-      <w:r>
-        <w:rPr>
-          <w:rFonts w:ascii="Arial" w:hAnsi="Arial" w:cs="Arial"/>
-        </w:rPr>
-        <w:lastRenderedPageBreak/>
         <w:t xml:space="preserve">      contract or tests rather than line by line</w:t>
       </w:r>
       <w:r>
@@ -37485,6 +37466,11 @@
           <w:rFonts w:ascii="Arial" w:hAnsi="Arial" w:cs="Arial"/>
         </w:rPr>
         <w:br/>
+      </w:r>
+      <w:r>
+        <w:rPr>
+          <w:rFonts w:ascii="Arial" w:hAnsi="Arial" w:cs="Arial"/>
+        </w:rPr>
         <w:t>- [ ] Tests added or updated; suite passes locally</w:t>
       </w:r>
       <w:r>
@@ -37559,6 +37545,11 @@
           <w:rFonts w:ascii="Arial" w:hAnsi="Arial" w:cs="Arial"/>
         </w:rPr>
         <w:br/>
+      </w:r>
+      <w:r>
+        <w:rPr>
+          <w:rFonts w:ascii="Arial" w:hAnsi="Arial" w:cs="Arial"/>
+        </w:rPr>
         <w:t>&lt;anything the reviewer should look at first: assumptions made, areas the</w:t>
       </w:r>
       <w:r>
@@ -37705,7 +37696,7 @@
 </file>
 
 <file path=word/endnotes.xml><?xml version="1.0" encoding="utf-8"?>
-<w:endnotes xmlns:wpc="http://schemas.microsoft.com/office/word/2010/wordprocessingCanvas" xmlns:cx="http://schemas.microsoft.com/office/drawing/2014/chartex" xmlns:cx1="http://schemas.microsoft.com/office/drawing/2015/9/8/chartex" xmlns:cx2="http://schemas.microsoft.com/office/drawing/2015/10/21/chartex" xmlns:cx3="http://schemas.microsoft.com/office/drawing/2016/5/9/chartex" xmlns:cx4="http://schemas.microsoft.com/office/drawing/2016/5/10/chartex" xmlns:cx5="http://schemas.microsoft.com/office/drawing/2016/5/11/chartex" xmlns:cx6="http://schemas.microsoft.com/office/drawing/2016/5/12/chartex" xmlns:cx7="http://schemas.microsoft.com/office/drawing/2016/5/13/chartex" xmlns:cx8="http://schemas.microsoft.com/office/drawing/2016/5/14/chartex" xmlns:mc="http://schemas.openxmlformats.org/markup-compatibility/2006" xmlns:aink="http://schemas.microsoft.com/office/drawing/2016/ink" xmlns:am3d="http://schemas.microsoft.com/office/drawing/2017/model3d" xmlns:o="urn:schemas-microsoft-com:office:office" xmlns:oel="http://schemas.microsoft.com/office/2019/extlst" xmlns:r="http://schemas.openxmlformats.org/officeDocument/2006/relationships" xmlns:m="http://schemas.openxmlformats.org/officeDocument/2006/math" xmlns:v="urn:schemas-microsoft-com:vml" xmlns:wp14="http://schemas.microsoft.com/office/word/2010/wordprocessingDrawing" xmlns:wp="http://schemas.openxmlformats.org/drawingml/2006/wordprocessingDrawing" xmlns:w10="urn:schemas-microsoft-com:office:word" xmlns:w="http://schemas.openxmlformats.org/wordprocessingml/2006/main" xmlns:w14="http://schemas.microsoft.com/office/word/2010/wordml" xmlns:w15="http://schemas.microsoft.com/office/word/2012/wordml" xmlns:w16cei="http://schemas.microsoft.com/office/word/2026/wordml/cei" xmlns:w16cex="http://schemas.microsoft.com/office/word/2018/wordml/cex" xmlns:w16cid="http://schemas.microsoft.com/office/word/2016/wordml/cid" xmlns:w16="http://schemas.microsoft.com/office/word/2018/wordml" xmlns:w16du="http://schemas.microsoft.com/office/word/2023/wordml/word16du" xmlns:w16sdtdh="http://schemas.microsoft.com/office/word/2020/wordml/sdtdatahash" xmlns:w16sdtfl="http://schemas.microsoft.com/office/word/2024/wordml/sdtformatlock" xmlns:w16se="http://schemas.microsoft.com/office/word/2015/wordml/symex" xmlns:wpg="http://schemas.microsoft.com/office/word/2010/wordprocessingGroup" xmlns:wpi="http://schemas.microsoft.com/office/word/2010/wordprocessingInk" xmlns:wne="http://schemas.microsoft.com/office/word/2006/wordml" xmlns:wps="http://schemas.microsoft.com/office/word/2010/wordprocessingShape" mc:Ignorable="w14 w15 w16se w16cid w16 w16cex w16sdtdh w16sdtfl w16du wp14">
+<w:endnotes xmlns:wpc="http://schemas.microsoft.com/office/word/2010/wordprocessingCanvas" xmlns:cx="http://schemas.microsoft.com/office/drawing/2014/chartex" xmlns:cx1="http://schemas.microsoft.com/office/drawing/2015/9/8/chartex" xmlns:cx2="http://schemas.microsoft.com/office/drawing/2015/10/21/chartex" xmlns:cx3="http://schemas.microsoft.com/office/drawing/2016/5/9/chartex" xmlns:cx4="http://schemas.microsoft.com/office/drawing/2016/5/10/chartex" xmlns:cx5="http://schemas.microsoft.com/office/drawing/2016/5/11/chartex" xmlns:cx6="http://schemas.microsoft.com/office/drawing/2016/5/12/chartex" xmlns:cx7="http://schemas.microsoft.com/office/drawing/2016/5/13/chartex" xmlns:cx8="http://schemas.microsoft.com/office/drawing/2016/5/14/chartex" xmlns:mc="http://schemas.openxmlformats.org/markup-compatibility/2006" xmlns:aink="http://schemas.microsoft.com/office/drawing/2016/ink" xmlns:am3d="http://schemas.microsoft.com/office/drawing/2017/model3d" xmlns:o="urn:schemas-microsoft-com:office:office" xmlns:oel="http://schemas.microsoft.com/office/2019/extlst" xmlns:r="http://schemas.openxmlformats.org/officeDocument/2006/relationships" xmlns:m="http://schemas.openxmlformats.org/officeDocument/2006/math" xmlns:v="urn:schemas-microsoft-com:vml" xmlns:wp14="http://schemas.microsoft.com/office/word/2010/wordprocessingDrawing" xmlns:wp="http://schemas.openxmlformats.org/drawingml/2006/wordprocessingDrawing" xmlns:w10="urn:schemas-microsoft-com:office:word" xmlns:w="http://schemas.openxmlformats.org/wordprocessingml/2006/main" xmlns:w14="http://schemas.microsoft.com/office/word/2010/wordml" xmlns:w15="http://schemas.microsoft.com/office/word/2012/wordml" xmlns:w16cex="http://schemas.microsoft.com/office/word/2018/wordml/cex" xmlns:w16cid="http://schemas.microsoft.com/office/word/2016/wordml/cid" xmlns:w16="http://schemas.microsoft.com/office/word/2018/wordml" xmlns:w16du="http://schemas.microsoft.com/office/word/2023/wordml/word16du" xmlns:w16sdtdh="http://schemas.microsoft.com/office/word/2020/wordml/sdtdatahash" xmlns:w16sdtfl="http://schemas.microsoft.com/office/word/2024/wordml/sdtformatlock" xmlns:w16se="http://schemas.microsoft.com/office/word/2015/wordml/symex" xmlns:wpg="http://schemas.microsoft.com/office/word/2010/wordprocessingGroup" xmlns:wpi="http://schemas.microsoft.com/office/word/2010/wordprocessingInk" xmlns:wne="http://schemas.microsoft.com/office/word/2006/wordml" xmlns:wps="http://schemas.microsoft.com/office/word/2010/wordprocessingShape" mc:Ignorable="w14 w15 w16se w16cid w16 w16cex w16sdtdh w16sdtfl w16du wp14">
   <w:endnote w:type="separator" w:id="-1">
     <w:p>
       <w:r>
@@ -37724,7 +37715,7 @@
 </file>
 
 <file path=word/footer1.xml><?xml version="1.0" encoding="utf-8"?>
-<w:ftr xmlns:wpc="http://schemas.microsoft.com/office/word/2010/wordprocessingCanvas" xmlns:cx="http://schemas.microsoft.com/office/drawing/2014/chartex" xmlns:cx1="http://schemas.microsoft.com/office/drawing/2015/9/8/chartex" xmlns:cx2="http://schemas.microsoft.com/office/drawing/2015/10/21/chartex" xmlns:cx3="http://schemas.microsoft.com/office/drawing/2016/5/9/chartex" xmlns:cx4="http://schemas.microsoft.com/office/drawing/2016/5/10/chartex" xmlns:cx5="http://schemas.microsoft.com/office/drawing/2016/5/11/chartex" xmlns:cx6="http://schemas.microsoft.com/office/drawing/2016/5/12/chartex" xmlns:cx7="http://schemas.microsoft.com/office/drawing/2016/5/13/chartex" xmlns:cx8="http://schemas.microsoft.com/office/drawing/2016/5/14/chartex" xmlns:mc="http://schemas.openxmlformats.org/markup-compatibility/2006" xmlns:aink="http://schemas.microsoft.com/office/drawing/2016/ink" xmlns:am3d="http://schemas.microsoft.com/office/drawing/2017/model3d" xmlns:o="urn:schemas-microsoft-com:office:office" xmlns:oel="http://schemas.microsoft.com/office/2019/extlst" xmlns:r="http://schemas.openxmlformats.org/officeDocument/2006/relationships" xmlns:m="http://schemas.openxmlformats.org/officeDocument/2006/math" xmlns:v="urn:schemas-microsoft-com:vml" xmlns:wp14="http://schemas.microsoft.com/office/word/2010/wordprocessingDrawing" xmlns:wp="http://schemas.openxmlformats.org/drawingml/2006/wordprocessingDrawing" xmlns:w10="urn:schemas-microsoft-com:office:word" xmlns:w="http://schemas.openxmlformats.org/wordprocessingml/2006/main" xmlns:w14="http://schemas.microsoft.com/office/word/2010/wordml" xmlns:w15="http://schemas.microsoft.com/office/word/2012/wordml" xmlns:w16cei="http://schemas.microsoft.com/office/word/2026/wordml/cei" xmlns:w16cex="http://schemas.microsoft.com/office/word/2018/wordml/cex" xmlns:w16cid="http://schemas.microsoft.com/office/word/2016/wordml/cid" xmlns:w16="http://schemas.microsoft.com/office/word/2018/wordml" xmlns:w16du="http://schemas.microsoft.com/office/word/2023/wordml/word16du" xmlns:w16sdtdh="http://schemas.microsoft.com/office/word/2020/wordml/sdtdatahash" xmlns:w16sdtfl="http://schemas.microsoft.com/office/word/2024/wordml/sdtformatlock" xmlns:w16se="http://schemas.microsoft.com/office/word/2015/wordml/symex" xmlns:wpg="http://schemas.microsoft.com/office/word/2010/wordprocessingGroup" xmlns:wpi="http://schemas.microsoft.com/office/word/2010/wordprocessingInk" xmlns:wne="http://schemas.microsoft.com/office/word/2006/wordml" xmlns:wps="http://schemas.microsoft.com/office/word/2010/wordprocessingShape" mc:Ignorable="w14 w15 w16se w16cid w16 w16cex w16sdtdh w16sdtfl w16du wp14">
+<w:ftr xmlns:wpc="http://schemas.microsoft.com/office/word/2010/wordprocessingCanvas" xmlns:cx="http://schemas.microsoft.com/office/drawing/2014/chartex" xmlns:cx1="http://schemas.microsoft.com/office/drawing/2015/9/8/chartex" xmlns:cx2="http://schemas.microsoft.com/office/drawing/2015/10/21/chartex" xmlns:cx3="http://schemas.microsoft.com/office/drawing/2016/5/9/chartex" xmlns:cx4="http://schemas.microsoft.com/office/drawing/2016/5/10/chartex" xmlns:cx5="http://schemas.microsoft.com/office/drawing/2016/5/11/chartex" xmlns:cx6="http://schemas.microsoft.com/office/drawing/2016/5/12/chartex" xmlns:cx7="http://schemas.microsoft.com/office/drawing/2016/5/13/chartex" xmlns:cx8="http://schemas.microsoft.com/office/drawing/2016/5/14/chartex" xmlns:mc="http://schemas.openxmlformats.org/markup-compatibility/2006" xmlns:aink="http://schemas.microsoft.com/office/drawing/2016/ink" xmlns:am3d="http://schemas.microsoft.com/office/drawing/2017/model3d" xmlns:o="urn:schemas-microsoft-com:office:office" xmlns:oel="http://schemas.microsoft.com/office/2019/extlst" xmlns:r="http://schemas.openxmlformats.org/officeDocument/2006/relationships" xmlns:m="http://schemas.openxmlformats.org/officeDocument/2006/math" xmlns:v="urn:schemas-microsoft-com:vml" xmlns:wp14="http://schemas.microsoft.com/office/word/2010/wordprocessingDrawing" xmlns:wp="http://schemas.openxmlformats.org/drawingml/2006/wordprocessingDrawing" xmlns:w10="urn:schemas-microsoft-com:office:word" xmlns:w="http://schemas.openxmlformats.org/wordprocessingml/2006/main" xmlns:w14="http://schemas.microsoft.com/office/word/2010/wordml" xmlns:w15="http://schemas.microsoft.com/office/word/2012/wordml" xmlns:w16cex="http://schemas.microsoft.com/office/word/2018/wordml/cex" xmlns:w16cid="http://schemas.microsoft.com/office/word/2016/wordml/cid" xmlns:w16="http://schemas.microsoft.com/office/word/2018/wordml" xmlns:w16du="http://schemas.microsoft.com/office/word/2023/wordml/word16du" xmlns:w16sdtdh="http://schemas.microsoft.com/office/word/2020/wordml/sdtdatahash" xmlns:w16sdtfl="http://schemas.microsoft.com/office/word/2024/wordml/sdtformatlock" xmlns:w16se="http://schemas.microsoft.com/office/word/2015/wordml/symex" xmlns:wpg="http://schemas.microsoft.com/office/word/2010/wordprocessingGroup" xmlns:wpi="http://schemas.microsoft.com/office/word/2010/wordprocessingInk" xmlns:wne="http://schemas.microsoft.com/office/word/2006/wordml" xmlns:wps="http://schemas.microsoft.com/office/word/2010/wordprocessingShape" mc:Ignorable="w14 w15 w16se w16cid w16 w16cex w16sdtdh w16sdtfl w16du wp14">
   <w:p>
     <w:pPr>
       <w:tabs>
@@ -37845,7 +37836,7 @@
 </file>
 
 <file path=word/footnotes.xml><?xml version="1.0" encoding="utf-8"?>
-<w:footnotes xmlns:wpc="http://schemas.microsoft.com/office/word/2010/wordprocessingCanvas" xmlns:cx="http://schemas.microsoft.com/office/drawing/2014/chartex" xmlns:cx1="http://schemas.microsoft.com/office/drawing/2015/9/8/chartex" xmlns:cx2="http://schemas.microsoft.com/office/drawing/2015/10/21/chartex" xmlns:cx3="http://schemas.microsoft.com/office/drawing/2016/5/9/chartex" xmlns:cx4="http://schemas.microsoft.com/office/drawing/2016/5/10/chartex" xmlns:cx5="http://schemas.microsoft.com/office/drawing/2016/5/11/chartex" xmlns:cx6="http://schemas.microsoft.com/office/drawing/2016/5/12/chartex" xmlns:cx7="http://schemas.microsoft.com/office/drawing/2016/5/13/chartex" xmlns:cx8="http://schemas.microsoft.com/office/drawing/2016/5/14/chartex" xmlns:mc="http://schemas.openxmlformats.org/markup-compatibility/2006" xmlns:aink="http://schemas.microsoft.com/office/drawing/2016/ink" xmlns:am3d="http://schemas.microsoft.com/office/drawing/2017/model3d" xmlns:o="urn:schemas-microsoft-com:office:office" xmlns:oel="http://schemas.microsoft.com/office/2019/extlst" xmlns:r="http://schemas.openxmlformats.org/officeDocument/2006/relationships" xmlns:m="http://schemas.openxmlformats.org/officeDocument/2006/math" xmlns:v="urn:schemas-microsoft-com:vml" xmlns:wp14="http://schemas.microsoft.com/office/word/2010/wordprocessingDrawing" xmlns:wp="http://schemas.openxmlformats.org/drawingml/2006/wordprocessingDrawing" xmlns:w10="urn:schemas-microsoft-com:office:word" xmlns:w="http://schemas.openxmlformats.org/wordprocessingml/2006/main" xmlns:w14="http://schemas.microsoft.com/office/word/2010/wordml" xmlns:w15="http://schemas.microsoft.com/office/word/2012/wordml" xmlns:w16cei="http://schemas.microsoft.com/office/word/2026/wordml/cei" xmlns:w16cex="http://schemas.microsoft.com/office/word/2018/wordml/cex" xmlns:w16cid="http://schemas.microsoft.com/office/word/2016/wordml/cid" xmlns:w16="http://schemas.microsoft.com/office/word/2018/wordml" xmlns:w16du="http://schemas.microsoft.com/office/word/2023/wordml/word16du" xmlns:w16sdtdh="http://schemas.microsoft.com/office/word/2020/wordml/sdtdatahash" xmlns:w16sdtfl="http://schemas.microsoft.com/office/word/2024/wordml/sdtformatlock" xmlns:w16se="http://schemas.microsoft.com/office/word/2015/wordml/symex" xmlns:wpg="http://schemas.microsoft.com/office/word/2010/wordprocessingGroup" xmlns:wpi="http://schemas.microsoft.com/office/word/2010/wordprocessingInk" xmlns:wne="http://schemas.microsoft.com/office/word/2006/wordml" xmlns:wps="http://schemas.microsoft.com/office/word/2010/wordprocessingShape" mc:Ignorable="w14 w15 w16se w16cid w16 w16cex w16sdtdh w16sdtfl w16du wp14">
+<w:footnotes xmlns:wpc="http://schemas.microsoft.com/office/word/2010/wordprocessingCanvas" xmlns:cx="http://schemas.microsoft.com/office/drawing/2014/chartex" xmlns:cx1="http://schemas.microsoft.com/office/drawing/2015/9/8/chartex" xmlns:cx2="http://schemas.microsoft.com/office/drawing/2015/10/21/chartex" xmlns:cx3="http://schemas.microsoft.com/office/drawing/2016/5/9/chartex" xmlns:cx4="http://schemas.microsoft.com/office/drawing/2016/5/10/chartex" xmlns:cx5="http://schemas.microsoft.com/office/drawing/2016/5/11/chartex" xmlns:cx6="http://schemas.microsoft.com/office/drawing/2016/5/12/chartex" xmlns:cx7="http://schemas.microsoft.com/office/drawing/2016/5/13/chartex" xmlns:cx8="http://schemas.microsoft.com/office/drawing/2016/5/14/chartex" xmlns:mc="http://schemas.openxmlformats.org/markup-compatibility/2006" xmlns:aink="http://schemas.microsoft.com/office/drawing/2016/ink" xmlns:am3d="http://schemas.microsoft.com/office/drawing/2017/model3d" xmlns:o="urn:schemas-microsoft-com:office:office" xmlns:oel="http://schemas.microsoft.com/office/2019/extlst" xmlns:r="http://schemas.openxmlformats.org/officeDocument/2006/relationships" xmlns:m="http://schemas.openxmlformats.org/officeDocument/2006/math" xmlns:v="urn:schemas-microsoft-com:vml" xmlns:wp14="http://schemas.microsoft.com/office/word/2010/wordprocessingDrawing" xmlns:wp="http://schemas.openxmlformats.org/drawingml/2006/wordprocessingDrawing" xmlns:w10="urn:schemas-microsoft-com:office:word" xmlns:w="http://schemas.openxmlformats.org/wordprocessingml/2006/main" xmlns:w14="http://schemas.microsoft.com/office/word/2010/wordml" xmlns:w15="http://schemas.microsoft.com/office/word/2012/wordml" xmlns:w16cex="http://schemas.microsoft.com/office/word/2018/wordml/cex" xmlns:w16cid="http://schemas.microsoft.com/office/word/2016/wordml/cid" xmlns:w16="http://schemas.microsoft.com/office/word/2018/wordml" xmlns:w16du="http://schemas.microsoft.com/office/word/2023/wordml/word16du" xmlns:w16sdtdh="http://schemas.microsoft.com/office/word/2020/wordml/sdtdatahash" xmlns:w16sdtfl="http://schemas.microsoft.com/office/word/2024/wordml/sdtformatlock" xmlns:w16se="http://schemas.microsoft.com/office/word/2015/wordml/symex" xmlns:wpg="http://schemas.microsoft.com/office/word/2010/wordprocessingGroup" xmlns:wpi="http://schemas.microsoft.com/office/word/2010/wordprocessingInk" xmlns:wne="http://schemas.microsoft.com/office/word/2006/wordml" xmlns:wps="http://schemas.microsoft.com/office/word/2010/wordprocessingShape" mc:Ignorable="w14 w15 w16se w16cid w16 w16cex w16sdtdh w16sdtfl w16du wp14">
   <w:footnote w:type="separator" w:id="-1">
     <w:p>
       <w:r>
@@ -37864,7 +37855,7 @@
 </file>
 
 <file path=word/header1.xml><?xml version="1.0" encoding="utf-8"?>
-<w:hdr xmlns:wpc="http://schemas.microsoft.com/office/word/2010/wordprocessingCanvas" xmlns:cx="http://schemas.microsoft.com/office/drawing/2014/chartex" xmlns:cx1="http://schemas.microsoft.com/office/drawing/2015/9/8/chartex" xmlns:cx2="http://schemas.microsoft.com/office/drawing/2015/10/21/chartex" xmlns:cx3="http://schemas.microsoft.com/office/drawing/2016/5/9/chartex" xmlns:cx4="http://schemas.microsoft.com/office/drawing/2016/5/10/chartex" xmlns:cx5="http://schemas.microsoft.com/office/drawing/2016/5/11/chartex" xmlns:cx6="http://schemas.microsoft.com/office/drawing/2016/5/12/chartex" xmlns:cx7="http://schemas.microsoft.com/office/drawing/2016/5/13/chartex" xmlns:cx8="http://schemas.microsoft.com/office/drawing/2016/5/14/chartex" xmlns:mc="http://schemas.openxmlformats.org/markup-compatibility/2006" xmlns:aink="http://schemas.microsoft.com/office/drawing/2016/ink" xmlns:am3d="http://schemas.microsoft.com/office/drawing/2017/model3d" xmlns:o="urn:schemas-microsoft-com:office:office" xmlns:oel="http://schemas.microsoft.com/office/2019/extlst" xmlns:r="http://schemas.openxmlformats.org/officeDocument/2006/relationships" xmlns:m="http://schemas.openxmlformats.org/officeDocument/2006/math" xmlns:v="urn:schemas-microsoft-com:vml" xmlns:wp14="http://schemas.microsoft.com/office/word/2010/wordprocessingDrawing" xmlns:wp="http://schemas.openxmlformats.org/drawingml/2006/wordprocessingDrawing" xmlns:w10="urn:schemas-microsoft-com:office:word" xmlns:w="http://schemas.openxmlformats.org/wordprocessingml/2006/main" xmlns:w14="http://schemas.microsoft.com/office/word/2010/wordml" xmlns:w15="http://schemas.microsoft.com/office/word/2012/wordml" xmlns:w16cei="http://schemas.microsoft.com/office/word/2026/wordml/cei" xmlns:w16cex="http://schemas.microsoft.com/office/word/2018/wordml/cex" xmlns:w16cid="http://schemas.microsoft.com/office/word/2016/wordml/cid" xmlns:w16="http://schemas.microsoft.com/office/word/2018/wordml" xmlns:w16du="http://schemas.microsoft.com/office/word/2023/wordml/word16du" xmlns:w16sdtdh="http://schemas.microsoft.com/office/word/2020/wordml/sdtdatahash" xmlns:w16sdtfl="http://schemas.microsoft.com/office/word/2024/wordml/sdtformatlock" xmlns:w16se="http://schemas.microsoft.com/office/word/2015/wordml/symex" xmlns:wpg="http://schemas.microsoft.com/office/word/2010/wordprocessingGroup" xmlns:wpi="http://schemas.microsoft.com/office/word/2010/wordprocessingInk" xmlns:wne="http://schemas.microsoft.com/office/word/2006/wordml" xmlns:wps="http://schemas.microsoft.com/office/word/2010/wordprocessingShape" mc:Ignorable="w14 w15 w16se w16cid w16 w16cex w16sdtdh w16sdtfl w16du wp14">
+<w:hdr xmlns:wpc="http://schemas.microsoft.com/office/word/2010/wordprocessingCanvas" xmlns:cx="http://schemas.microsoft.com/office/drawing/2014/chartex" xmlns:cx1="http://schemas.microsoft.com/office/drawing/2015/9/8/chartex" xmlns:cx2="http://schemas.microsoft.com/office/drawing/2015/10/21/chartex" xmlns:cx3="http://schemas.microsoft.com/office/drawing/2016/5/9/chartex" xmlns:cx4="http://schemas.microsoft.com/office/drawing/2016/5/10/chartex" xmlns:cx5="http://schemas.microsoft.com/office/drawing/2016/5/11/chartex" xmlns:cx6="http://schemas.microsoft.com/office/drawing/2016/5/12/chartex" xmlns:cx7="http://schemas.microsoft.com/office/drawing/2016/5/13/chartex" xmlns:cx8="http://schemas.microsoft.com/office/drawing/2016/5/14/chartex" xmlns:mc="http://schemas.openxmlformats.org/markup-compatibility/2006" xmlns:aink="http://schemas.microsoft.com/office/drawing/2016/ink" xmlns:am3d="http://schemas.microsoft.com/office/drawing/2017/model3d" xmlns:o="urn:schemas-microsoft-com:office:office" xmlns:oel="http://schemas.microsoft.com/office/2019/extlst" xmlns:r="http://schemas.openxmlformats.org/officeDocument/2006/relationships" xmlns:m="http://schemas.openxmlformats.org/officeDocument/2006/math" xmlns:v="urn:schemas-microsoft-com:vml" xmlns:wp14="http://schemas.microsoft.com/office/word/2010/wordprocessingDrawing" xmlns:wp="http://schemas.openxmlformats.org/drawingml/2006/wordprocessingDrawing" xmlns:w10="urn:schemas-microsoft-com:office:word" xmlns:w="http://schemas.openxmlformats.org/wordprocessingml/2006/main" xmlns:w14="http://schemas.microsoft.com/office/word/2010/wordml" xmlns:w15="http://schemas.microsoft.com/office/word/2012/wordml" xmlns:w16cex="http://schemas.microsoft.com/office/word/2018/wordml/cex" xmlns:w16cid="http://schemas.microsoft.com/office/word/2016/wordml/cid" xmlns:w16="http://schemas.microsoft.com/office/word/2018/wordml" xmlns:w16du="http://schemas.microsoft.com/office/word/2023/wordml/word16du" xmlns:w16sdtdh="http://schemas.microsoft.com/office/word/2020/wordml/sdtdatahash" xmlns:w16sdtfl="http://schemas.microsoft.com/office/word/2024/wordml/sdtformatlock" xmlns:w16se="http://schemas.microsoft.com/office/word/2015/wordml/symex" xmlns:wpg="http://schemas.microsoft.com/office/word/2010/wordprocessingGroup" xmlns:wpi="http://schemas.microsoft.com/office/word/2010/wordprocessingInk" xmlns:wne="http://schemas.microsoft.com/office/word/2006/wordml" xmlns:wps="http://schemas.microsoft.com/office/word/2010/wordprocessingShape" mc:Ignorable="w14 w15 w16se w16cid w16 w16cex w16sdtdh w16sdtfl w16du wp14">
   <w:p>
     <w:pPr>
       <w:pStyle w:val="Ttulo1"/>
@@ -37959,7 +37950,7 @@
 </file>
 
 <file path=word/numbering.xml><?xml version="1.0" encoding="utf-8"?>
-<w:numbering xmlns:wpc="http://schemas.microsoft.com/office/word/2010/wordprocessingCanvas" xmlns:cx="http://schemas.microsoft.com/office/drawing/2014/chartex" xmlns:cx1="http://schemas.microsoft.com/office/drawing/2015/9/8/chartex" xmlns:cx2="http://schemas.microsoft.com/office/drawing/2015/10/21/chartex" xmlns:cx3="http://schemas.microsoft.com/office/drawing/2016/5/9/chartex" xmlns:cx4="http://schemas.microsoft.com/office/drawing/2016/5/10/chartex" xmlns:cx5="http://schemas.microsoft.com/office/drawing/2016/5/11/chartex" xmlns:cx6="http://schemas.microsoft.com/office/drawing/2016/5/12/chartex" xmlns:cx7="http://schemas.microsoft.com/office/drawing/2016/5/13/chartex" xmlns:cx8="http://schemas.microsoft.com/office/drawing/2016/5/14/chartex" xmlns:mc="http://schemas.openxmlformats.org/markup-compatibility/2006" xmlns:aink="http://schemas.microsoft.com/office/drawing/2016/ink" xmlns:am3d="http://schemas.microsoft.com/office/drawing/2017/model3d" xmlns:o="urn:schemas-microsoft-com:office:office" xmlns:oel="http://schemas.microsoft.com/office/2019/extlst" xmlns:r="http://schemas.openxmlformats.org/officeDocument/2006/relationships" xmlns:m="http://schemas.openxmlformats.org/officeDocument/2006/math" xmlns:v="urn:schemas-microsoft-com:vml" xmlns:wp14="http://schemas.microsoft.com/office/word/2010/wordprocessingDrawing" xmlns:wp="http://schemas.openxmlformats.org/drawingml/2006/wordprocessingDrawing" xmlns:w10="urn:schemas-microsoft-com:office:word" xmlns:w="http://schemas.openxmlformats.org/wordprocessingml/2006/main" xmlns:w14="http://schemas.microsoft.com/office/word/2010/wordml" xmlns:w15="http://schemas.microsoft.com/office/word/2012/wordml" xmlns:w16cei="http://schemas.microsoft.com/office/word/2026/wordml/cei" xmlns:w16cex="http://schemas.microsoft.com/office/word/2018/wordml/cex" xmlns:w16cid="http://schemas.microsoft.com/office/word/2016/wordml/cid" xmlns:w16="http://schemas.microsoft.com/office/word/2018/wordml" xmlns:w16du="http://schemas.microsoft.com/office/word/2023/wordml/word16du" xmlns:w16sdtdh="http://schemas.microsoft.com/office/word/2020/wordml/sdtdatahash" xmlns:w16sdtfl="http://schemas.microsoft.com/office/word/2024/wordml/sdtformatlock" xmlns:w16se="http://schemas.microsoft.com/office/word/2015/wordml/symex" xmlns:wpg="http://schemas.microsoft.com/office/word/2010/wordprocessingGroup" xmlns:wpi="http://schemas.microsoft.com/office/word/2010/wordprocessingInk" xmlns:wne="http://schemas.microsoft.com/office/word/2006/wordml" xmlns:wps="http://schemas.microsoft.com/office/word/2010/wordprocessingShape" mc:Ignorable="w14 w15 w16se w16cid w16 w16cex w16sdtdh w16sdtfl w16du wp14">
+<w:numbering xmlns:wpc="http://schemas.microsoft.com/office/word/2010/wordprocessingCanvas" xmlns:cx="http://schemas.microsoft.com/office/drawing/2014/chartex" xmlns:cx1="http://schemas.microsoft.com/office/drawing/2015/9/8/chartex" xmlns:cx2="http://schemas.microsoft.com/office/drawing/2015/10/21/chartex" xmlns:cx3="http://schemas.microsoft.com/office/drawing/2016/5/9/chartex" xmlns:cx4="http://schemas.microsoft.com/office/drawing/2016/5/10/chartex" xmlns:cx5="http://schemas.microsoft.com/office/drawing/2016/5/11/chartex" xmlns:cx6="http://schemas.microsoft.com/office/drawing/2016/5/12/chartex" xmlns:cx7="http://schemas.microsoft.com/office/drawing/2016/5/13/chartex" xmlns:cx8="http://schemas.microsoft.com/office/drawing/2016/5/14/chartex" xmlns:mc="http://schemas.openxmlformats.org/markup-compatibility/2006" xmlns:aink="http://schemas.microsoft.com/office/drawing/2016/ink" xmlns:am3d="http://schemas.microsoft.com/office/drawing/2017/model3d" xmlns:o="urn:schemas-microsoft-com:office:office" xmlns:oel="http://schemas.microsoft.com/office/2019/extlst" xmlns:r="http://schemas.openxmlformats.org/officeDocument/2006/relationships" xmlns:m="http://schemas.openxmlformats.org/officeDocument/2006/math" xmlns:v="urn:schemas-microsoft-com:vml" xmlns:wp14="http://schemas.microsoft.com/office/word/2010/wordprocessingDrawing" xmlns:wp="http://schemas.openxmlformats.org/drawingml/2006/wordprocessingDrawing" xmlns:w10="urn:schemas-microsoft-com:office:word" xmlns:w="http://schemas.openxmlformats.org/wordprocessingml/2006/main" xmlns:w14="http://schemas.microsoft.com/office/word/2010/wordml" xmlns:w15="http://schemas.microsoft.com/office/word/2012/wordml" xmlns:w16cex="http://schemas.microsoft.com/office/word/2018/wordml/cex" xmlns:w16cid="http://schemas.microsoft.com/office/word/2016/wordml/cid" xmlns:w16="http://schemas.microsoft.com/office/word/2018/wordml" xmlns:w16du="http://schemas.microsoft.com/office/word/2023/wordml/word16du" xmlns:w16sdtdh="http://schemas.microsoft.com/office/word/2020/wordml/sdtdatahash" xmlns:w16sdtfl="http://schemas.microsoft.com/office/word/2024/wordml/sdtformatlock" xmlns:w16se="http://schemas.microsoft.com/office/word/2015/wordml/symex" xmlns:wpg="http://schemas.microsoft.com/office/word/2010/wordprocessingGroup" xmlns:wpi="http://schemas.microsoft.com/office/word/2010/wordprocessingInk" xmlns:wne="http://schemas.microsoft.com/office/word/2006/wordml" xmlns:wps="http://schemas.microsoft.com/office/word/2010/wordprocessingShape" mc:Ignorable="w14 w15 w16se w16cid w16 w16cex w16sdtdh w16sdtfl w16du wp14">
   <w:abstractNum w:abstractNumId="0" w15:restartNumberingAfterBreak="0">
     <w:nsid w:val="014A2BCA"/>
     <w:multiLevelType w:val="multilevel"/>

</xml_diff>